<commit_message>
Updated docs with test results
</commit_message>
<xml_diff>
--- a/docs/MealMate_Documentation.docx
+++ b/docs/MealMate_Documentation.docx
@@ -6,7 +6,6 @@
       <w:pPr>
         <w:spacing w:after="40"/>
       </w:pPr>
-      <w:proofErr w:type="spellStart"/>
       <w:r>
         <w:rPr>
           <w:b/>
@@ -17,7 +16,6 @@
         </w:rPr>
         <w:t>MealMate</w:t>
       </w:r>
-      <w:proofErr w:type="spellEnd"/>
       <w:r>
         <w:rPr>
           <w:color w:val="2B7A9E"/>
@@ -44,33 +42,17 @@
       <w:pPr>
         <w:spacing w:after="160"/>
       </w:pPr>
-      <w:proofErr w:type="spellStart"/>
       <w:r>
         <w:rPr>
           <w:color w:val="333333"/>
         </w:rPr>
         <w:t>MealMate</w:t>
       </w:r>
-      <w:proofErr w:type="spellEnd"/>
       <w:r>
         <w:rPr>
           <w:color w:val="333333"/>
         </w:rPr>
-        <w:t xml:space="preserve"> is a mobile app that helps users plan their weekly meals and build a shopping list automatically. It pulls meal data and images from </w:t>
-      </w:r>
-      <w:proofErr w:type="spellStart"/>
-      <w:r>
-        <w:rPr>
-          <w:color w:val="333333"/>
-        </w:rPr>
-        <w:t>TheMealDB</w:t>
-      </w:r>
-      <w:proofErr w:type="spellEnd"/>
-      <w:r>
-        <w:rPr>
-          <w:color w:val="333333"/>
-        </w:rPr>
-        <w:t xml:space="preserve"> API. Users can browse meals by category, search by name, view full recipes with ingredients and instructions, and save meals to a weekly plan.</w:t>
+        <w:t xml:space="preserve"> is a mobile app that helps users plan their weekly meals and build a shopping list automatically. It pulls meal data and images from TheMealDB API. Users can browse meals by category, search by name, view full recipes with ingredients and instructions, and save meals to a weekly plan.</w:t>
       </w:r>
     </w:p>
     <w:p>
@@ -114,12 +96,6 @@
         <w:gridCol w:w="6360"/>
       </w:tblGrid>
       <w:tr>
-        <w:tblPrEx>
-          <w:tblCellMar>
-            <w:top w:w="0" w:type="dxa"/>
-            <w:bottom w:w="0" w:type="dxa"/>
-          </w:tblCellMar>
-        </w:tblPrEx>
         <w:tc>
           <w:tcPr>
             <w:tcW w:w="3000" w:type="dxa"/>
@@ -182,12 +158,6 @@
         </w:tc>
       </w:tr>
       <w:tr>
-        <w:tblPrEx>
-          <w:tblCellMar>
-            <w:top w:w="0" w:type="dxa"/>
-            <w:bottom w:w="0" w:type="dxa"/>
-          </w:tblCellMar>
-        </w:tblPrEx>
         <w:tc>
           <w:tcPr>
             <w:tcW w:w="3000" w:type="dxa"/>
@@ -242,36 +212,12 @@
                 <w:sz w:val="18"/>
                 <w:szCs w:val="18"/>
               </w:rPr>
-              <w:t xml:space="preserve">Home screen loads all meal categories from </w:t>
-            </w:r>
-            <w:proofErr w:type="spellStart"/>
-            <w:r>
-              <w:rPr>
-                <w:color w:val="333333"/>
-                <w:sz w:val="18"/>
-                <w:szCs w:val="18"/>
-              </w:rPr>
-              <w:t>TheMealDB</w:t>
-            </w:r>
-            <w:proofErr w:type="spellEnd"/>
-            <w:r>
-              <w:rPr>
-                <w:color w:val="333333"/>
-                <w:sz w:val="18"/>
-                <w:szCs w:val="18"/>
-              </w:rPr>
-              <w:t xml:space="preserve"> with thumbnail images</w:t>
+              <w:t>Home screen loads all meal categories from TheMealDB with thumbnail images</w:t>
             </w:r>
           </w:p>
         </w:tc>
       </w:tr>
       <w:tr>
-        <w:tblPrEx>
-          <w:tblCellMar>
-            <w:top w:w="0" w:type="dxa"/>
-            <w:bottom w:w="0" w:type="dxa"/>
-          </w:tblCellMar>
-        </w:tblPrEx>
         <w:tc>
           <w:tcPr>
             <w:tcW w:w="3000" w:type="dxa"/>
@@ -332,12 +278,6 @@
         </w:tc>
       </w:tr>
       <w:tr>
-        <w:tblPrEx>
-          <w:tblCellMar>
-            <w:top w:w="0" w:type="dxa"/>
-            <w:bottom w:w="0" w:type="dxa"/>
-          </w:tblCellMar>
-        </w:tblPrEx>
         <w:tc>
           <w:tcPr>
             <w:tcW w:w="3000" w:type="dxa"/>
@@ -398,12 +338,6 @@
         </w:tc>
       </w:tr>
       <w:tr>
-        <w:tblPrEx>
-          <w:tblCellMar>
-            <w:top w:w="0" w:type="dxa"/>
-            <w:bottom w:w="0" w:type="dxa"/>
-          </w:tblCellMar>
-        </w:tblPrEx>
         <w:tc>
           <w:tcPr>
             <w:tcW w:w="3000" w:type="dxa"/>
@@ -464,12 +398,6 @@
         </w:tc>
       </w:tr>
       <w:tr>
-        <w:tblPrEx>
-          <w:tblCellMar>
-            <w:top w:w="0" w:type="dxa"/>
-            <w:bottom w:w="0" w:type="dxa"/>
-          </w:tblCellMar>
-        </w:tblPrEx>
         <w:tc>
           <w:tcPr>
             <w:tcW w:w="3000" w:type="dxa"/>
@@ -530,12 +458,6 @@
         </w:tc>
       </w:tr>
       <w:tr>
-        <w:tblPrEx>
-          <w:tblCellMar>
-            <w:top w:w="0" w:type="dxa"/>
-            <w:bottom w:w="0" w:type="dxa"/>
-          </w:tblCellMar>
-        </w:tblPrEx>
         <w:tc>
           <w:tcPr>
             <w:tcW w:w="3000" w:type="dxa"/>
@@ -596,12 +518,6 @@
         </w:tc>
       </w:tr>
       <w:tr>
-        <w:tblPrEx>
-          <w:tblCellMar>
-            <w:top w:w="0" w:type="dxa"/>
-            <w:bottom w:w="0" w:type="dxa"/>
-          </w:tblCellMar>
-        </w:tblPrEx>
         <w:tc>
           <w:tcPr>
             <w:tcW w:w="3000" w:type="dxa"/>
@@ -662,12 +578,6 @@
         </w:tc>
       </w:tr>
       <w:tr>
-        <w:tblPrEx>
-          <w:tblCellMar>
-            <w:top w:w="0" w:type="dxa"/>
-            <w:bottom w:w="0" w:type="dxa"/>
-          </w:tblCellMar>
-        </w:tblPrEx>
         <w:tc>
           <w:tcPr>
             <w:tcW w:w="3000" w:type="dxa"/>
@@ -722,38 +632,12 @@
                 <w:sz w:val="18"/>
                 <w:szCs w:val="18"/>
               </w:rPr>
-              <w:t xml:space="preserve">Meal plan and search history are saved to </w:t>
-            </w:r>
-            <w:proofErr w:type="spellStart"/>
-            <w:proofErr w:type="gramStart"/>
-            <w:r>
-              <w:rPr>
-                <w:color w:val="333333"/>
-                <w:sz w:val="18"/>
-                <w:szCs w:val="18"/>
-              </w:rPr>
-              <w:t>AsyncStorage</w:t>
-            </w:r>
-            <w:proofErr w:type="spellEnd"/>
-            <w:proofErr w:type="gramEnd"/>
-            <w:r>
-              <w:rPr>
-                <w:color w:val="333333"/>
-                <w:sz w:val="18"/>
-                <w:szCs w:val="18"/>
-              </w:rPr>
-              <w:t xml:space="preserve"> so data survives app restarts</w:t>
+              <w:t>Meal plan and search history are saved to AsyncStorage so data survives app restarts</w:t>
             </w:r>
           </w:p>
         </w:tc>
       </w:tr>
       <w:tr>
-        <w:tblPrEx>
-          <w:tblCellMar>
-            <w:top w:w="0" w:type="dxa"/>
-            <w:bottom w:w="0" w:type="dxa"/>
-          </w:tblCellMar>
-        </w:tblPrEx>
         <w:tc>
           <w:tcPr>
             <w:tcW w:w="3000" w:type="dxa"/>
@@ -844,12 +728,6 @@
         <w:gridCol w:w="7160"/>
       </w:tblGrid>
       <w:tr>
-        <w:tblPrEx>
-          <w:tblCellMar>
-            <w:top w:w="0" w:type="dxa"/>
-            <w:bottom w:w="0" w:type="dxa"/>
-          </w:tblCellMar>
-        </w:tblPrEx>
         <w:tc>
           <w:tcPr>
             <w:tcW w:w="2200" w:type="dxa"/>
@@ -912,12 +790,6 @@
         </w:tc>
       </w:tr>
       <w:tr>
-        <w:tblPrEx>
-          <w:tblCellMar>
-            <w:top w:w="0" w:type="dxa"/>
-            <w:bottom w:w="0" w:type="dxa"/>
-          </w:tblCellMar>
-        </w:tblPrEx>
         <w:tc>
           <w:tcPr>
             <w:tcW w:w="2200" w:type="dxa"/>
@@ -978,12 +850,6 @@
         </w:tc>
       </w:tr>
       <w:tr>
-        <w:tblPrEx>
-          <w:tblCellMar>
-            <w:top w:w="0" w:type="dxa"/>
-            <w:bottom w:w="0" w:type="dxa"/>
-          </w:tblCellMar>
-        </w:tblPrEx>
         <w:tc>
           <w:tcPr>
             <w:tcW w:w="2200" w:type="dxa"/>
@@ -1044,12 +910,6 @@
         </w:tc>
       </w:tr>
       <w:tr>
-        <w:tblPrEx>
-          <w:tblCellMar>
-            <w:top w:w="0" w:type="dxa"/>
-            <w:bottom w:w="0" w:type="dxa"/>
-          </w:tblCellMar>
-        </w:tblPrEx>
         <w:tc>
           <w:tcPr>
             <w:tcW w:w="2200" w:type="dxa"/>
@@ -1110,12 +970,6 @@
         </w:tc>
       </w:tr>
       <w:tr>
-        <w:tblPrEx>
-          <w:tblCellMar>
-            <w:top w:w="0" w:type="dxa"/>
-            <w:bottom w:w="0" w:type="dxa"/>
-          </w:tblCellMar>
-        </w:tblPrEx>
         <w:tc>
           <w:tcPr>
             <w:tcW w:w="2200" w:type="dxa"/>
@@ -1176,12 +1030,6 @@
         </w:tc>
       </w:tr>
       <w:tr>
-        <w:tblPrEx>
-          <w:tblCellMar>
-            <w:top w:w="0" w:type="dxa"/>
-            <w:bottom w:w="0" w:type="dxa"/>
-          </w:tblCellMar>
-        </w:tblPrEx>
         <w:tc>
           <w:tcPr>
             <w:tcW w:w="2200" w:type="dxa"/>
@@ -1242,12 +1090,6 @@
         </w:tc>
       </w:tr>
       <w:tr>
-        <w:tblPrEx>
-          <w:tblCellMar>
-            <w:top w:w="0" w:type="dxa"/>
-            <w:bottom w:w="0" w:type="dxa"/>
-          </w:tblCellMar>
-        </w:tblPrEx>
         <w:tc>
           <w:tcPr>
             <w:tcW w:w="2200" w:type="dxa"/>
@@ -1328,21 +1170,7 @@
         <w:rPr>
           <w:color w:val="333333"/>
         </w:rPr>
-        <w:t>Home Screen (</w:t>
-      </w:r>
-      <w:proofErr w:type="spellStart"/>
-      <w:r>
-        <w:rPr>
-          <w:color w:val="333333"/>
-        </w:rPr>
-        <w:t>index.ts</w:t>
-      </w:r>
-      <w:proofErr w:type="spellEnd"/>
-      <w:r>
-        <w:rPr>
-          <w:color w:val="333333"/>
-        </w:rPr>
-        <w:t>):</w:t>
+        <w:t>Home Screen (index.ts):</w:t>
       </w:r>
     </w:p>
     <w:p>
@@ -1354,6 +1182,7 @@
       </w:pPr>
       <w:r>
         <w:rPr>
+          <w:noProof/>
           <w:color w:val="333333"/>
         </w:rPr>
         <w:drawing>
@@ -1408,25 +1237,7 @@
           <w:bCs/>
           <w:color w:val="333333"/>
         </w:rPr>
-        <w:t> Categories Screen (</w:t>
-      </w:r>
-      <w:proofErr w:type="spellStart"/>
-      <w:r>
-        <w:rPr>
-          <w:b/>
-          <w:bCs/>
-          <w:color w:val="333333"/>
-        </w:rPr>
-        <w:t>categories.tsx</w:t>
-      </w:r>
-      <w:proofErr w:type="spellEnd"/>
-      <w:r>
-        <w:rPr>
-          <w:b/>
-          <w:bCs/>
-          <w:color w:val="333333"/>
-        </w:rPr>
-        <w:t>)</w:t>
+        <w:t> Categories Screen (categories.tsx)</w:t>
       </w:r>
       <w:r>
         <w:rPr>
@@ -1450,6 +1261,7 @@
         <w:rPr>
           <w:b/>
           <w:bCs/>
+          <w:noProof/>
           <w:color w:val="333333"/>
         </w:rPr>
         <w:drawing>
@@ -1504,25 +1316,7 @@
           <w:bCs/>
           <w:color w:val="333333"/>
         </w:rPr>
-        <w:t>Search Screen (</w:t>
-      </w:r>
-      <w:proofErr w:type="spellStart"/>
-      <w:r>
-        <w:rPr>
-          <w:b/>
-          <w:bCs/>
-          <w:color w:val="333333"/>
-        </w:rPr>
-        <w:t>search.tsx</w:t>
-      </w:r>
-      <w:proofErr w:type="spellEnd"/>
-      <w:r>
-        <w:rPr>
-          <w:b/>
-          <w:bCs/>
-          <w:color w:val="333333"/>
-        </w:rPr>
-        <w:t>)</w:t>
+        <w:t>Search Screen (search.tsx)</w:t>
       </w:r>
     </w:p>
     <w:p>
@@ -1538,6 +1332,7 @@
         <w:rPr>
           <w:b/>
           <w:bCs/>
+          <w:noProof/>
           <w:color w:val="333333"/>
         </w:rPr>
         <w:lastRenderedPageBreak/>
@@ -1593,35 +1388,7 @@
           <w:bCs/>
           <w:color w:val="333333"/>
         </w:rPr>
-        <w:t>Meal Detail Screen (meal/[id</w:t>
-      </w:r>
-      <w:proofErr w:type="gramStart"/>
-      <w:r>
-        <w:rPr>
-          <w:b/>
-          <w:bCs/>
-          <w:color w:val="333333"/>
-        </w:rPr>
-        <w:t>].</w:t>
-      </w:r>
-      <w:proofErr w:type="spellStart"/>
-      <w:r>
-        <w:rPr>
-          <w:b/>
-          <w:bCs/>
-          <w:color w:val="333333"/>
-        </w:rPr>
-        <w:t>tsx</w:t>
-      </w:r>
-      <w:proofErr w:type="spellEnd"/>
-      <w:proofErr w:type="gramEnd"/>
-      <w:r>
-        <w:rPr>
-          <w:b/>
-          <w:bCs/>
-          <w:color w:val="333333"/>
-        </w:rPr>
-        <w:t>)</w:t>
+        <w:t>Meal Detail Screen (meal/[id].tsx)</w:t>
       </w:r>
     </w:p>
     <w:p>
@@ -1637,6 +1404,7 @@
         <w:rPr>
           <w:b/>
           <w:bCs/>
+          <w:noProof/>
           <w:color w:val="333333"/>
         </w:rPr>
         <w:drawing>
@@ -1691,43 +1459,7 @@
           <w:bCs/>
           <w:color w:val="333333"/>
         </w:rPr>
-        <w:t>Meal Plan Screen (</w:t>
-      </w:r>
-      <w:proofErr w:type="spellStart"/>
-      <w:r>
-        <w:rPr>
-          <w:b/>
-          <w:bCs/>
-          <w:color w:val="333333"/>
-        </w:rPr>
-        <w:t>mealplan</w:t>
-      </w:r>
-      <w:proofErr w:type="spellEnd"/>
-      <w:r>
-        <w:rPr>
-          <w:b/>
-          <w:bCs/>
-          <w:color w:val="333333"/>
-        </w:rPr>
-        <w:t>/</w:t>
-      </w:r>
-      <w:proofErr w:type="spellStart"/>
-      <w:r>
-        <w:rPr>
-          <w:b/>
-          <w:bCs/>
-          <w:color w:val="333333"/>
-        </w:rPr>
-        <w:t>index.tsx</w:t>
-      </w:r>
-      <w:proofErr w:type="spellEnd"/>
-      <w:r>
-        <w:rPr>
-          <w:b/>
-          <w:bCs/>
-          <w:color w:val="333333"/>
-        </w:rPr>
-        <w:t>)</w:t>
+        <w:t>Meal Plan Screen (mealplan/index.tsx)</w:t>
       </w:r>
     </w:p>
     <w:p>
@@ -1743,6 +1475,7 @@
         <w:rPr>
           <w:b/>
           <w:bCs/>
+          <w:noProof/>
           <w:color w:val="333333"/>
         </w:rPr>
         <w:lastRenderedPageBreak/>
@@ -1798,43 +1531,7 @@
           <w:bCs/>
           <w:color w:val="333333"/>
         </w:rPr>
-        <w:t> Shopping List Screen (</w:t>
-      </w:r>
-      <w:proofErr w:type="spellStart"/>
-      <w:r>
-        <w:rPr>
-          <w:b/>
-          <w:bCs/>
-          <w:color w:val="333333"/>
-        </w:rPr>
-        <w:t>mealplan</w:t>
-      </w:r>
-      <w:proofErr w:type="spellEnd"/>
-      <w:r>
-        <w:rPr>
-          <w:b/>
-          <w:bCs/>
-          <w:color w:val="333333"/>
-        </w:rPr>
-        <w:t>/</w:t>
-      </w:r>
-      <w:proofErr w:type="spellStart"/>
-      <w:r>
-        <w:rPr>
-          <w:b/>
-          <w:bCs/>
-          <w:color w:val="333333"/>
-        </w:rPr>
-        <w:t>shopping.tsx</w:t>
-      </w:r>
-      <w:proofErr w:type="spellEnd"/>
-      <w:r>
-        <w:rPr>
-          <w:b/>
-          <w:bCs/>
-          <w:color w:val="333333"/>
-        </w:rPr>
-        <w:t>)</w:t>
+        <w:t> Shopping List Screen (mealplan/shopping.tsx)</w:t>
       </w:r>
     </w:p>
     <w:p>
@@ -1846,6 +1543,7 @@
       </w:pPr>
       <w:r>
         <w:rPr>
+          <w:noProof/>
           <w:color w:val="333333"/>
         </w:rPr>
         <w:drawing>
@@ -1935,12 +1633,6 @@
         <w:gridCol w:w="4160"/>
       </w:tblGrid>
       <w:tr>
-        <w:tblPrEx>
-          <w:tblCellMar>
-            <w:top w:w="0" w:type="dxa"/>
-            <w:bottom w:w="0" w:type="dxa"/>
-          </w:tblCellMar>
-        </w:tblPrEx>
         <w:tc>
           <w:tcPr>
             <w:tcW w:w="2000" w:type="dxa"/>
@@ -2033,12 +1725,6 @@
         </w:tc>
       </w:tr>
       <w:tr>
-        <w:tblPrEx>
-          <w:tblCellMar>
-            <w:top w:w="0" w:type="dxa"/>
-            <w:bottom w:w="0" w:type="dxa"/>
-          </w:tblCellMar>
-        </w:tblPrEx>
         <w:tc>
           <w:tcPr>
             <w:tcW w:w="2000" w:type="dxa"/>
@@ -2091,18 +1777,8 @@
                 <w:sz w:val="18"/>
                 <w:szCs w:val="18"/>
               </w:rPr>
-              <w:t>app/</w:t>
-            </w:r>
-            <w:proofErr w:type="spellStart"/>
-            <w:r>
-              <w:rPr>
-                <w:color w:val="333333"/>
-                <w:sz w:val="18"/>
-                <w:szCs w:val="18"/>
-              </w:rPr>
-              <w:t>index.tsx</w:t>
-            </w:r>
-            <w:proofErr w:type="spellEnd"/>
+              <w:t>app/index.tsx</w:t>
+            </w:r>
           </w:p>
         </w:tc>
         <w:tc>
@@ -2135,12 +1811,6 @@
         </w:tc>
       </w:tr>
       <w:tr>
-        <w:tblPrEx>
-          <w:tblCellMar>
-            <w:top w:w="0" w:type="dxa"/>
-            <w:bottom w:w="0" w:type="dxa"/>
-          </w:tblCellMar>
-        </w:tblPrEx>
         <w:tc>
           <w:tcPr>
             <w:tcW w:w="2000" w:type="dxa"/>
@@ -2165,18 +1835,8 @@
                 <w:sz w:val="18"/>
                 <w:szCs w:val="18"/>
               </w:rPr>
-              <w:t>/</w:t>
-            </w:r>
-            <w:proofErr w:type="gramStart"/>
-            <w:r>
-              <w:rPr>
-                <w:color w:val="333333"/>
-                <w:sz w:val="18"/>
-                <w:szCs w:val="18"/>
-              </w:rPr>
-              <w:t>categories</w:t>
-            </w:r>
-            <w:proofErr w:type="gramEnd"/>
+              <w:t>/categories</w:t>
+            </w:r>
           </w:p>
         </w:tc>
         <w:tc>
@@ -2203,18 +1863,8 @@
                 <w:sz w:val="18"/>
                 <w:szCs w:val="18"/>
               </w:rPr>
-              <w:t>app/</w:t>
-            </w:r>
-            <w:proofErr w:type="spellStart"/>
-            <w:r>
-              <w:rPr>
-                <w:color w:val="333333"/>
-                <w:sz w:val="18"/>
-                <w:szCs w:val="18"/>
-              </w:rPr>
-              <w:t>categories.tsx</w:t>
-            </w:r>
-            <w:proofErr w:type="spellEnd"/>
+              <w:t>app/categories.tsx</w:t>
+            </w:r>
           </w:p>
         </w:tc>
         <w:tc>
@@ -2247,12 +1897,6 @@
         </w:tc>
       </w:tr>
       <w:tr>
-        <w:tblPrEx>
-          <w:tblCellMar>
-            <w:top w:w="0" w:type="dxa"/>
-            <w:bottom w:w="0" w:type="dxa"/>
-          </w:tblCellMar>
-        </w:tblPrEx>
         <w:tc>
           <w:tcPr>
             <w:tcW w:w="2000" w:type="dxa"/>
@@ -2277,18 +1921,8 @@
                 <w:sz w:val="18"/>
                 <w:szCs w:val="18"/>
               </w:rPr>
-              <w:t>/</w:t>
-            </w:r>
-            <w:proofErr w:type="gramStart"/>
-            <w:r>
-              <w:rPr>
-                <w:color w:val="333333"/>
-                <w:sz w:val="18"/>
-                <w:szCs w:val="18"/>
-              </w:rPr>
-              <w:t>search</w:t>
-            </w:r>
-            <w:proofErr w:type="gramEnd"/>
+              <w:t>/search</w:t>
+            </w:r>
           </w:p>
         </w:tc>
         <w:tc>
@@ -2315,18 +1949,8 @@
                 <w:sz w:val="18"/>
                 <w:szCs w:val="18"/>
               </w:rPr>
-              <w:t>app/</w:t>
-            </w:r>
-            <w:proofErr w:type="spellStart"/>
-            <w:r>
-              <w:rPr>
-                <w:color w:val="333333"/>
-                <w:sz w:val="18"/>
-                <w:szCs w:val="18"/>
-              </w:rPr>
-              <w:t>search.tsx</w:t>
-            </w:r>
-            <w:proofErr w:type="spellEnd"/>
+              <w:t>app/search.tsx</w:t>
+            </w:r>
           </w:p>
         </w:tc>
         <w:tc>
@@ -2359,12 +1983,6 @@
         </w:tc>
       </w:tr>
       <w:tr>
-        <w:tblPrEx>
-          <w:tblCellMar>
-            <w:top w:w="0" w:type="dxa"/>
-            <w:bottom w:w="0" w:type="dxa"/>
-          </w:tblCellMar>
-        </w:tblPrEx>
         <w:tc>
           <w:tcPr>
             <w:tcW w:w="2000" w:type="dxa"/>
@@ -2417,28 +2035,8 @@
                 <w:sz w:val="18"/>
                 <w:szCs w:val="18"/>
               </w:rPr>
-              <w:t>app/meal/[id</w:t>
-            </w:r>
-            <w:proofErr w:type="gramStart"/>
-            <w:r>
-              <w:rPr>
-                <w:color w:val="333333"/>
-                <w:sz w:val="18"/>
-                <w:szCs w:val="18"/>
-              </w:rPr>
-              <w:t>].</w:t>
-            </w:r>
-            <w:proofErr w:type="spellStart"/>
-            <w:r>
-              <w:rPr>
-                <w:color w:val="333333"/>
-                <w:sz w:val="18"/>
-                <w:szCs w:val="18"/>
-              </w:rPr>
-              <w:t>tsx</w:t>
-            </w:r>
-            <w:proofErr w:type="spellEnd"/>
-            <w:proofErr w:type="gramEnd"/>
+              <w:t>app/meal/[id].tsx</w:t>
+            </w:r>
           </w:p>
         </w:tc>
         <w:tc>
@@ -2471,12 +2069,6 @@
         </w:tc>
       </w:tr>
       <w:tr>
-        <w:tblPrEx>
-          <w:tblCellMar>
-            <w:top w:w="0" w:type="dxa"/>
-            <w:bottom w:w="0" w:type="dxa"/>
-          </w:tblCellMar>
-        </w:tblPrEx>
         <w:tc>
           <w:tcPr>
             <w:tcW w:w="2000" w:type="dxa"/>
@@ -2502,20 +2094,8 @@
                 <w:szCs w:val="18"/>
               </w:rPr>
               <w:lastRenderedPageBreak/>
-              <w:t>/</w:t>
-            </w:r>
-            <w:proofErr w:type="spellStart"/>
-            <w:proofErr w:type="gramStart"/>
-            <w:r>
-              <w:rPr>
-                <w:color w:val="333333"/>
-                <w:sz w:val="18"/>
-                <w:szCs w:val="18"/>
-              </w:rPr>
-              <w:t>mealplan</w:t>
-            </w:r>
-            <w:proofErr w:type="spellEnd"/>
-            <w:proofErr w:type="gramEnd"/>
+              <w:t>/mealplan</w:t>
+            </w:r>
           </w:p>
         </w:tc>
         <w:tc>
@@ -2542,36 +2122,8 @@
                 <w:sz w:val="18"/>
                 <w:szCs w:val="18"/>
               </w:rPr>
-              <w:t>app/</w:t>
-            </w:r>
-            <w:proofErr w:type="spellStart"/>
-            <w:r>
-              <w:rPr>
-                <w:color w:val="333333"/>
-                <w:sz w:val="18"/>
-                <w:szCs w:val="18"/>
-              </w:rPr>
-              <w:t>mealplan</w:t>
-            </w:r>
-            <w:proofErr w:type="spellEnd"/>
-            <w:r>
-              <w:rPr>
-                <w:color w:val="333333"/>
-                <w:sz w:val="18"/>
-                <w:szCs w:val="18"/>
-              </w:rPr>
-              <w:t>/</w:t>
-            </w:r>
-            <w:proofErr w:type="spellStart"/>
-            <w:r>
-              <w:rPr>
-                <w:color w:val="333333"/>
-                <w:sz w:val="18"/>
-                <w:szCs w:val="18"/>
-              </w:rPr>
-              <w:t>index.tsx</w:t>
-            </w:r>
-            <w:proofErr w:type="spellEnd"/>
+              <w:t>app/mealplan/index.tsx</w:t>
+            </w:r>
           </w:p>
         </w:tc>
         <w:tc>
@@ -2604,12 +2156,6 @@
         </w:tc>
       </w:tr>
       <w:tr>
-        <w:tblPrEx>
-          <w:tblCellMar>
-            <w:top w:w="0" w:type="dxa"/>
-            <w:bottom w:w="0" w:type="dxa"/>
-          </w:tblCellMar>
-        </w:tblPrEx>
         <w:tc>
           <w:tcPr>
             <w:tcW w:w="2000" w:type="dxa"/>
@@ -2634,25 +2180,7 @@
                 <w:sz w:val="18"/>
                 <w:szCs w:val="18"/>
               </w:rPr>
-              <w:t>/</w:t>
-            </w:r>
-            <w:proofErr w:type="spellStart"/>
-            <w:r>
-              <w:rPr>
-                <w:color w:val="333333"/>
-                <w:sz w:val="18"/>
-                <w:szCs w:val="18"/>
-              </w:rPr>
-              <w:t>mealplan</w:t>
-            </w:r>
-            <w:proofErr w:type="spellEnd"/>
-            <w:r>
-              <w:rPr>
-                <w:color w:val="333333"/>
-                <w:sz w:val="18"/>
-                <w:szCs w:val="18"/>
-              </w:rPr>
-              <w:t>/shopping</w:t>
+              <w:t>/mealplan/shopping</w:t>
             </w:r>
           </w:p>
         </w:tc>
@@ -2680,36 +2208,8 @@
                 <w:sz w:val="18"/>
                 <w:szCs w:val="18"/>
               </w:rPr>
-              <w:t>app/</w:t>
-            </w:r>
-            <w:proofErr w:type="spellStart"/>
-            <w:r>
-              <w:rPr>
-                <w:color w:val="333333"/>
-                <w:sz w:val="18"/>
-                <w:szCs w:val="18"/>
-              </w:rPr>
-              <w:t>mealplan</w:t>
-            </w:r>
-            <w:proofErr w:type="spellEnd"/>
-            <w:r>
-              <w:rPr>
-                <w:color w:val="333333"/>
-                <w:sz w:val="18"/>
-                <w:szCs w:val="18"/>
-              </w:rPr>
-              <w:t>/</w:t>
-            </w:r>
-            <w:proofErr w:type="spellStart"/>
-            <w:r>
-              <w:rPr>
-                <w:color w:val="333333"/>
-                <w:sz w:val="18"/>
-                <w:szCs w:val="18"/>
-              </w:rPr>
-              <w:t>shopping.tsx</w:t>
-            </w:r>
-            <w:proofErr w:type="spellEnd"/>
+              <w:t>app/mealplan/shopping.tsx</w:t>
+            </w:r>
           </w:p>
         </w:tc>
         <w:tc>
@@ -2769,49 +2269,7 @@
         <w:rPr>
           <w:color w:val="333333"/>
         </w:rPr>
-        <w:t xml:space="preserve">Remote data: </w:t>
-      </w:r>
-      <w:proofErr w:type="spellStart"/>
-      <w:r>
-        <w:rPr>
-          <w:color w:val="333333"/>
-        </w:rPr>
-        <w:t>TheMealDB</w:t>
-      </w:r>
-      <w:proofErr w:type="spellEnd"/>
-      <w:r>
-        <w:rPr>
-          <w:color w:val="333333"/>
-        </w:rPr>
-        <w:t xml:space="preserve"> API provides categories, meal lists, search results, meal details, and random meals. All API calls live in </w:t>
-      </w:r>
-      <w:proofErr w:type="spellStart"/>
-      <w:r>
-        <w:rPr>
-          <w:color w:val="333333"/>
-        </w:rPr>
-        <w:t>src</w:t>
-      </w:r>
-      <w:proofErr w:type="spellEnd"/>
-      <w:r>
-        <w:rPr>
-          <w:color w:val="333333"/>
-        </w:rPr>
-        <w:t>/services/</w:t>
-      </w:r>
-      <w:proofErr w:type="spellStart"/>
-      <w:r>
-        <w:rPr>
-          <w:color w:val="333333"/>
-        </w:rPr>
-        <w:t>api.ts</w:t>
-      </w:r>
-      <w:proofErr w:type="spellEnd"/>
-      <w:r>
-        <w:rPr>
-          <w:color w:val="333333"/>
-        </w:rPr>
-        <w:t xml:space="preserve"> and use a shared fetch wrapper with error handling. If a call fails, the screen shows an error message with a retry button.</w:t>
+        <w:t>Remote data: TheMealDB API provides categories, meal lists, search results, meal details, and random meals. All API calls live in src/services/api.ts and use a shared fetch wrapper with error handling. If a call fails, the screen shows an error message with a retry button.</w:t>
       </w:r>
     </w:p>
     <w:p>
@@ -2822,99 +2280,7 @@
         <w:rPr>
           <w:color w:val="333333"/>
         </w:rPr>
-        <w:t xml:space="preserve">Local data: The meal plan and search history are stored in </w:t>
-      </w:r>
-      <w:proofErr w:type="spellStart"/>
-      <w:r>
-        <w:rPr>
-          <w:color w:val="333333"/>
-        </w:rPr>
-        <w:t>AsyncStorage</w:t>
-      </w:r>
-      <w:proofErr w:type="spellEnd"/>
-      <w:r>
-        <w:rPr>
-          <w:color w:val="333333"/>
-        </w:rPr>
-        <w:t xml:space="preserve"> through helper functions in </w:t>
-      </w:r>
-      <w:proofErr w:type="spellStart"/>
-      <w:r>
-        <w:rPr>
-          <w:color w:val="333333"/>
-        </w:rPr>
-        <w:t>src</w:t>
-      </w:r>
-      <w:proofErr w:type="spellEnd"/>
-      <w:r>
-        <w:rPr>
-          <w:color w:val="333333"/>
-        </w:rPr>
-        <w:t>/utils/</w:t>
-      </w:r>
-      <w:proofErr w:type="spellStart"/>
-      <w:r>
-        <w:rPr>
-          <w:color w:val="333333"/>
-        </w:rPr>
-        <w:t>storage.ts</w:t>
-      </w:r>
-      <w:proofErr w:type="spellEnd"/>
-      <w:r>
-        <w:rPr>
-          <w:color w:val="333333"/>
-        </w:rPr>
-        <w:t>. The meal plan is managed by a React Context (</w:t>
-      </w:r>
-      <w:proofErr w:type="spellStart"/>
-      <w:r>
-        <w:rPr>
-          <w:color w:val="333333"/>
-        </w:rPr>
-        <w:t>MealPlanContext</w:t>
-      </w:r>
-      <w:proofErr w:type="spellEnd"/>
-      <w:r>
-        <w:rPr>
-          <w:color w:val="333333"/>
-        </w:rPr>
-        <w:t xml:space="preserve">) that wraps the entire app. Any screen can call </w:t>
-      </w:r>
-      <w:proofErr w:type="spellStart"/>
-      <w:proofErr w:type="gramStart"/>
-      <w:r>
-        <w:rPr>
-          <w:color w:val="333333"/>
-        </w:rPr>
-        <w:t>useMealPlan</w:t>
-      </w:r>
-      <w:proofErr w:type="spellEnd"/>
-      <w:r>
-        <w:rPr>
-          <w:color w:val="333333"/>
-        </w:rPr>
-        <w:t>(</w:t>
-      </w:r>
-      <w:proofErr w:type="gramEnd"/>
-      <w:r>
-        <w:rPr>
-          <w:color w:val="333333"/>
-        </w:rPr>
-        <w:t xml:space="preserve">) to read or write the plan. The context auto-saves to </w:t>
-      </w:r>
-      <w:proofErr w:type="spellStart"/>
-      <w:r>
-        <w:rPr>
-          <w:color w:val="333333"/>
-        </w:rPr>
-        <w:t>AsyncStorage</w:t>
-      </w:r>
-      <w:proofErr w:type="spellEnd"/>
-      <w:r>
-        <w:rPr>
-          <w:color w:val="333333"/>
-        </w:rPr>
-        <w:t xml:space="preserve"> whenever the plan changes.</w:t>
+        <w:t>Local data: The meal plan and search history are stored in AsyncStorage through helper functions in src/utils/storage.ts. The meal plan is managed by a React Context (MealPlanContext) that wraps the entire app. Any screen can call useMealPlan() to read or write the plan. The context auto-saves to AsyncStorage whenever the plan changes.</w:t>
       </w:r>
     </w:p>
     <w:p>
@@ -2925,35 +2291,7 @@
         <w:rPr>
           <w:color w:val="333333"/>
         </w:rPr>
-        <w:t xml:space="preserve">Derived data: The shopping list is not stored anywhere. It is computed on the fly by fetching full details for each planned meal, parsing all their ingredients, and combining duplicates. This logic lives in </w:t>
-      </w:r>
-      <w:proofErr w:type="spellStart"/>
-      <w:r>
-        <w:rPr>
-          <w:color w:val="333333"/>
-        </w:rPr>
-        <w:t>src</w:t>
-      </w:r>
-      <w:proofErr w:type="spellEnd"/>
-      <w:r>
-        <w:rPr>
-          <w:color w:val="333333"/>
-        </w:rPr>
-        <w:t>/utils/</w:t>
-      </w:r>
-      <w:proofErr w:type="spellStart"/>
-      <w:r>
-        <w:rPr>
-          <w:color w:val="333333"/>
-        </w:rPr>
-        <w:t>shoppingList.ts</w:t>
-      </w:r>
-      <w:proofErr w:type="spellEnd"/>
-      <w:r>
-        <w:rPr>
-          <w:color w:val="333333"/>
-        </w:rPr>
-        <w:t>.</w:t>
+        <w:t>Derived data: The shopping list is not stored anywhere. It is computed on the fly by fetching full details for each planned meal, parsing all their ingredients, and combining duplicates. This logic lives in src/utils/shoppingList.ts.</w:t>
       </w:r>
     </w:p>
     <w:p>
@@ -2968,282 +2306,66 @@
       <w:pPr>
         <w:spacing w:after="160"/>
       </w:pPr>
-      <w:proofErr w:type="spellStart"/>
       <w:r>
         <w:rPr>
           <w:color w:val="333333"/>
         </w:rPr>
-        <w:t>MealCard</w:t>
-      </w:r>
-      <w:proofErr w:type="spellEnd"/>
-      <w:r>
-        <w:rPr>
-          <w:color w:val="333333"/>
-        </w:rPr>
-        <w:t xml:space="preserve"> (</w:t>
-      </w:r>
-      <w:proofErr w:type="spellStart"/>
-      <w:r>
-        <w:rPr>
-          <w:color w:val="333333"/>
-        </w:rPr>
-        <w:t>src</w:t>
-      </w:r>
-      <w:proofErr w:type="spellEnd"/>
-      <w:r>
-        <w:rPr>
-          <w:color w:val="333333"/>
-        </w:rPr>
-        <w:t>/components/</w:t>
-      </w:r>
-      <w:proofErr w:type="spellStart"/>
-      <w:r>
-        <w:rPr>
-          <w:color w:val="333333"/>
-        </w:rPr>
-        <w:t>MealCard.tsx</w:t>
-      </w:r>
-      <w:proofErr w:type="spellEnd"/>
-      <w:r>
-        <w:rPr>
-          <w:color w:val="333333"/>
-        </w:rPr>
-        <w:t>) — the card shown for each meal. Takes a meal summary and navigates to the detail screen on tap.</w:t>
+        <w:t>MealCard (src/components/MealCard.tsx) — the card shown for each meal. Takes a meal summary and navigates to the detail screen on tap.</w:t>
       </w:r>
     </w:p>
     <w:p>
       <w:pPr>
         <w:spacing w:after="160"/>
       </w:pPr>
-      <w:proofErr w:type="spellStart"/>
       <w:r>
         <w:rPr>
           <w:color w:val="333333"/>
         </w:rPr>
-        <w:t>CategoryCard</w:t>
-      </w:r>
-      <w:proofErr w:type="spellEnd"/>
-      <w:r>
-        <w:rPr>
-          <w:color w:val="333333"/>
-        </w:rPr>
-        <w:t xml:space="preserve"> (</w:t>
-      </w:r>
-      <w:proofErr w:type="spellStart"/>
-      <w:r>
-        <w:rPr>
-          <w:color w:val="333333"/>
-        </w:rPr>
-        <w:t>src</w:t>
-      </w:r>
-      <w:proofErr w:type="spellEnd"/>
-      <w:r>
-        <w:rPr>
-          <w:color w:val="333333"/>
-        </w:rPr>
-        <w:t>/components/</w:t>
-      </w:r>
-      <w:proofErr w:type="spellStart"/>
-      <w:r>
-        <w:rPr>
-          <w:color w:val="333333"/>
-        </w:rPr>
-        <w:t>CategoryCard.tsx</w:t>
-      </w:r>
-      <w:proofErr w:type="spellEnd"/>
-      <w:r>
-        <w:rPr>
-          <w:color w:val="333333"/>
-        </w:rPr>
-        <w:t>) — a compact card for each category on the home screen. Navigates to the category browser on tap.</w:t>
+        <w:t>CategoryCard (src/components/CategoryCard.tsx) — a compact card for each category on the home screen. Navigates to the category browser on tap.</w:t>
       </w:r>
     </w:p>
     <w:p>
       <w:pPr>
         <w:spacing w:after="160"/>
       </w:pPr>
-      <w:proofErr w:type="spellStart"/>
       <w:r>
         <w:rPr>
           <w:color w:val="333333"/>
         </w:rPr>
-        <w:t>LoadingSpinner</w:t>
-      </w:r>
-      <w:proofErr w:type="spellEnd"/>
-      <w:r>
-        <w:rPr>
-          <w:color w:val="333333"/>
-        </w:rPr>
-        <w:t xml:space="preserve"> (</w:t>
-      </w:r>
-      <w:proofErr w:type="spellStart"/>
-      <w:r>
-        <w:rPr>
-          <w:color w:val="333333"/>
-        </w:rPr>
-        <w:t>src</w:t>
-      </w:r>
-      <w:proofErr w:type="spellEnd"/>
-      <w:r>
-        <w:rPr>
-          <w:color w:val="333333"/>
-        </w:rPr>
-        <w:t>/components/</w:t>
-      </w:r>
-      <w:proofErr w:type="spellStart"/>
-      <w:r>
-        <w:rPr>
-          <w:color w:val="333333"/>
-        </w:rPr>
-        <w:t>LoadingSpinner.tsx</w:t>
-      </w:r>
-      <w:proofErr w:type="spellEnd"/>
-      <w:r>
-        <w:rPr>
-          <w:color w:val="333333"/>
-        </w:rPr>
-        <w:t>) — a centered spinner with a message. Used on every screen while waiting for data.</w:t>
+        <w:t>LoadingSpinner (src/components/LoadingSpinner.tsx) — a centered spinner with a message. Used on every screen while waiting for data.</w:t>
       </w:r>
     </w:p>
     <w:p>
       <w:pPr>
         <w:spacing w:after="160"/>
       </w:pPr>
-      <w:proofErr w:type="spellStart"/>
       <w:r>
         <w:rPr>
           <w:color w:val="333333"/>
         </w:rPr>
-        <w:t>ErrorDisplay</w:t>
-      </w:r>
-      <w:proofErr w:type="spellEnd"/>
-      <w:r>
-        <w:rPr>
-          <w:color w:val="333333"/>
-        </w:rPr>
-        <w:t xml:space="preserve"> (</w:t>
-      </w:r>
-      <w:proofErr w:type="spellStart"/>
-      <w:r>
-        <w:rPr>
-          <w:color w:val="333333"/>
-        </w:rPr>
-        <w:t>src</w:t>
-      </w:r>
-      <w:proofErr w:type="spellEnd"/>
-      <w:r>
-        <w:rPr>
-          <w:color w:val="333333"/>
-        </w:rPr>
-        <w:t>/components/</w:t>
-      </w:r>
-      <w:proofErr w:type="spellStart"/>
-      <w:r>
-        <w:rPr>
-          <w:color w:val="333333"/>
-        </w:rPr>
-        <w:t>ErrorDisplay.tsx</w:t>
-      </w:r>
-      <w:proofErr w:type="spellEnd"/>
-      <w:r>
-        <w:rPr>
-          <w:color w:val="333333"/>
-        </w:rPr>
-        <w:t>) — an error message with a retry button. Used on every screen when an API call fails.</w:t>
+        <w:t>ErrorDisplay (src/components/ErrorDisplay.tsx) — an error message with a retry button. Used on every screen when an API call fails.</w:t>
       </w:r>
     </w:p>
     <w:p>
       <w:pPr>
         <w:spacing w:after="160"/>
       </w:pPr>
-      <w:proofErr w:type="spellStart"/>
       <w:r>
         <w:rPr>
           <w:color w:val="333333"/>
         </w:rPr>
-        <w:t>EmptyState</w:t>
-      </w:r>
-      <w:proofErr w:type="spellEnd"/>
-      <w:r>
-        <w:rPr>
-          <w:color w:val="333333"/>
-        </w:rPr>
-        <w:t xml:space="preserve"> (</w:t>
-      </w:r>
-      <w:proofErr w:type="spellStart"/>
-      <w:r>
-        <w:rPr>
-          <w:color w:val="333333"/>
-        </w:rPr>
-        <w:t>src</w:t>
-      </w:r>
-      <w:proofErr w:type="spellEnd"/>
-      <w:r>
-        <w:rPr>
-          <w:color w:val="333333"/>
-        </w:rPr>
-        <w:t>/components/</w:t>
-      </w:r>
-      <w:proofErr w:type="spellStart"/>
-      <w:r>
-        <w:rPr>
-          <w:color w:val="333333"/>
-        </w:rPr>
-        <w:t>EmptyState.tsx</w:t>
-      </w:r>
-      <w:proofErr w:type="spellEnd"/>
-      <w:r>
-        <w:rPr>
-          <w:color w:val="333333"/>
-        </w:rPr>
-        <w:t>) — a friendly message when a screen has no data to show.</w:t>
+        <w:t>EmptyState (src/components/EmptyState.tsx) — a friendly message when a screen has no data to show.</w:t>
       </w:r>
     </w:p>
     <w:p>
       <w:pPr>
         <w:spacing w:after="160"/>
       </w:pPr>
-      <w:proofErr w:type="spellStart"/>
       <w:r>
         <w:rPr>
           <w:color w:val="333333"/>
         </w:rPr>
-        <w:t>IngredientCheckbox</w:t>
-      </w:r>
-      <w:proofErr w:type="spellEnd"/>
-      <w:r>
-        <w:rPr>
-          <w:color w:val="333333"/>
-        </w:rPr>
-        <w:t xml:space="preserve"> (</w:t>
-      </w:r>
-      <w:proofErr w:type="spellStart"/>
-      <w:r>
-        <w:rPr>
-          <w:color w:val="333333"/>
-        </w:rPr>
-        <w:t>src</w:t>
-      </w:r>
-      <w:proofErr w:type="spellEnd"/>
-      <w:r>
-        <w:rPr>
-          <w:color w:val="333333"/>
-        </w:rPr>
-        <w:t>/components/</w:t>
-      </w:r>
-      <w:proofErr w:type="spellStart"/>
-      <w:r>
-        <w:rPr>
-          <w:color w:val="333333"/>
-        </w:rPr>
-        <w:t>IngredientCheckbox.tsx</w:t>
-      </w:r>
-      <w:proofErr w:type="spellEnd"/>
-      <w:r>
-        <w:rPr>
-          <w:color w:val="333333"/>
-        </w:rPr>
-        <w:t>) — a checkable row on the shopping list with ingredient name and measurement.</w:t>
+        <w:t>IngredientCheckbox (src/components/IngredientCheckbox.tsx) — a checkable row on the shopping list with ingredient name and measurement.</w:t>
       </w:r>
     </w:p>
     <w:p>
@@ -3262,16 +2384,8 @@
         <w:rPr>
           <w:color w:val="333333"/>
         </w:rPr>
-        <w:t xml:space="preserve">All data comes from </w:t>
+        <w:t>All data comes from TheMealDB</w:t>
       </w:r>
-      <w:proofErr w:type="spellStart"/>
-      <w:r>
-        <w:rPr>
-          <w:color w:val="333333"/>
-        </w:rPr>
-        <w:t>TheMealDB</w:t>
-      </w:r>
-      <w:proofErr w:type="spellEnd"/>
       <w:r>
         <w:rPr>
           <w:color w:val="333333"/>
@@ -3301,12 +2415,6 @@
         <w:gridCol w:w="4680"/>
       </w:tblGrid>
       <w:tr>
-        <w:tblPrEx>
-          <w:tblCellMar>
-            <w:top w:w="0" w:type="dxa"/>
-            <w:bottom w:w="0" w:type="dxa"/>
-          </w:tblCellMar>
-        </w:tblPrEx>
         <w:tc>
           <w:tcPr>
             <w:tcW w:w="4680" w:type="dxa"/>
@@ -3369,12 +2477,6 @@
         </w:tc>
       </w:tr>
       <w:tr>
-        <w:tblPrEx>
-          <w:tblCellMar>
-            <w:top w:w="0" w:type="dxa"/>
-            <w:bottom w:w="0" w:type="dxa"/>
-          </w:tblCellMar>
-        </w:tblPrEx>
         <w:tc>
           <w:tcPr>
             <w:tcW w:w="4680" w:type="dxa"/>
@@ -3399,54 +2501,8 @@
                 <w:sz w:val="18"/>
                 <w:szCs w:val="18"/>
               </w:rPr>
-              <w:t>GET /</w:t>
-            </w:r>
-            <w:proofErr w:type="spellStart"/>
-            <w:r>
-              <w:rPr>
-                <w:color w:val="333333"/>
-                <w:sz w:val="18"/>
-                <w:szCs w:val="18"/>
-              </w:rPr>
-              <w:t>api</w:t>
-            </w:r>
-            <w:proofErr w:type="spellEnd"/>
-            <w:r>
-              <w:rPr>
-                <w:color w:val="333333"/>
-                <w:sz w:val="18"/>
-                <w:szCs w:val="18"/>
-              </w:rPr>
-              <w:t>/</w:t>
-            </w:r>
-            <w:proofErr w:type="spellStart"/>
-            <w:r>
-              <w:rPr>
-                <w:color w:val="333333"/>
-                <w:sz w:val="18"/>
-                <w:szCs w:val="18"/>
-              </w:rPr>
-              <w:t>json</w:t>
-            </w:r>
-            <w:proofErr w:type="spellEnd"/>
-            <w:r>
-              <w:rPr>
-                <w:color w:val="333333"/>
-                <w:sz w:val="18"/>
-                <w:szCs w:val="18"/>
-              </w:rPr>
-              <w:t>/v1/1/</w:t>
-            </w:r>
-            <w:proofErr w:type="spellStart"/>
-            <w:r>
-              <w:rPr>
-                <w:color w:val="333333"/>
-                <w:sz w:val="18"/>
-                <w:szCs w:val="18"/>
-              </w:rPr>
-              <w:t>categories.php</w:t>
-            </w:r>
-            <w:proofErr w:type="spellEnd"/>
+              <w:t>GET /api/json/v1/1/categories.php</w:t>
+            </w:r>
           </w:p>
         </w:tc>
         <w:tc>
@@ -3479,12 +2535,6 @@
         </w:tc>
       </w:tr>
       <w:tr>
-        <w:tblPrEx>
-          <w:tblCellMar>
-            <w:top w:w="0" w:type="dxa"/>
-            <w:bottom w:w="0" w:type="dxa"/>
-          </w:tblCellMar>
-        </w:tblPrEx>
         <w:tc>
           <w:tcPr>
             <w:tcW w:w="4680" w:type="dxa"/>
@@ -3509,61 +2559,7 @@
                 <w:sz w:val="18"/>
                 <w:szCs w:val="18"/>
               </w:rPr>
-              <w:t>GET /</w:t>
-            </w:r>
-            <w:proofErr w:type="spellStart"/>
-            <w:r>
-              <w:rPr>
-                <w:color w:val="333333"/>
-                <w:sz w:val="18"/>
-                <w:szCs w:val="18"/>
-              </w:rPr>
-              <w:t>api</w:t>
-            </w:r>
-            <w:proofErr w:type="spellEnd"/>
-            <w:r>
-              <w:rPr>
-                <w:color w:val="333333"/>
-                <w:sz w:val="18"/>
-                <w:szCs w:val="18"/>
-              </w:rPr>
-              <w:t>/</w:t>
-            </w:r>
-            <w:proofErr w:type="spellStart"/>
-            <w:r>
-              <w:rPr>
-                <w:color w:val="333333"/>
-                <w:sz w:val="18"/>
-                <w:szCs w:val="18"/>
-              </w:rPr>
-              <w:t>json</w:t>
-            </w:r>
-            <w:proofErr w:type="spellEnd"/>
-            <w:r>
-              <w:rPr>
-                <w:color w:val="333333"/>
-                <w:sz w:val="18"/>
-                <w:szCs w:val="18"/>
-              </w:rPr>
-              <w:t>/v1/1/</w:t>
-            </w:r>
-            <w:proofErr w:type="spellStart"/>
-            <w:r>
-              <w:rPr>
-                <w:color w:val="333333"/>
-                <w:sz w:val="18"/>
-                <w:szCs w:val="18"/>
-              </w:rPr>
-              <w:t>filter.php?c</w:t>
-            </w:r>
-            <w:proofErr w:type="spellEnd"/>
-            <w:r>
-              <w:rPr>
-                <w:color w:val="333333"/>
-                <w:sz w:val="18"/>
-                <w:szCs w:val="18"/>
-              </w:rPr>
-              <w:t>={cat}</w:t>
+              <w:t>GET /api/json/v1/1/filter.php?c={cat}</w:t>
             </w:r>
           </w:p>
         </w:tc>
@@ -3597,12 +2593,6 @@
         </w:tc>
       </w:tr>
       <w:tr>
-        <w:tblPrEx>
-          <w:tblCellMar>
-            <w:top w:w="0" w:type="dxa"/>
-            <w:bottom w:w="0" w:type="dxa"/>
-          </w:tblCellMar>
-        </w:tblPrEx>
         <w:tc>
           <w:tcPr>
             <w:tcW w:w="4680" w:type="dxa"/>
@@ -3627,61 +2617,7 @@
                 <w:sz w:val="18"/>
                 <w:szCs w:val="18"/>
               </w:rPr>
-              <w:t>GET /</w:t>
-            </w:r>
-            <w:proofErr w:type="spellStart"/>
-            <w:r>
-              <w:rPr>
-                <w:color w:val="333333"/>
-                <w:sz w:val="18"/>
-                <w:szCs w:val="18"/>
-              </w:rPr>
-              <w:t>api</w:t>
-            </w:r>
-            <w:proofErr w:type="spellEnd"/>
-            <w:r>
-              <w:rPr>
-                <w:color w:val="333333"/>
-                <w:sz w:val="18"/>
-                <w:szCs w:val="18"/>
-              </w:rPr>
-              <w:t>/</w:t>
-            </w:r>
-            <w:proofErr w:type="spellStart"/>
-            <w:r>
-              <w:rPr>
-                <w:color w:val="333333"/>
-                <w:sz w:val="18"/>
-                <w:szCs w:val="18"/>
-              </w:rPr>
-              <w:t>json</w:t>
-            </w:r>
-            <w:proofErr w:type="spellEnd"/>
-            <w:r>
-              <w:rPr>
-                <w:color w:val="333333"/>
-                <w:sz w:val="18"/>
-                <w:szCs w:val="18"/>
-              </w:rPr>
-              <w:t>/v1/1/</w:t>
-            </w:r>
-            <w:proofErr w:type="spellStart"/>
-            <w:r>
-              <w:rPr>
-                <w:color w:val="333333"/>
-                <w:sz w:val="18"/>
-                <w:szCs w:val="18"/>
-              </w:rPr>
-              <w:t>search.php?s</w:t>
-            </w:r>
-            <w:proofErr w:type="spellEnd"/>
-            <w:r>
-              <w:rPr>
-                <w:color w:val="333333"/>
-                <w:sz w:val="18"/>
-                <w:szCs w:val="18"/>
-              </w:rPr>
-              <w:t>={query}</w:t>
+              <w:t>GET /api/json/v1/1/search.php?s={query}</w:t>
             </w:r>
           </w:p>
         </w:tc>
@@ -3715,12 +2651,6 @@
         </w:tc>
       </w:tr>
       <w:tr>
-        <w:tblPrEx>
-          <w:tblCellMar>
-            <w:top w:w="0" w:type="dxa"/>
-            <w:bottom w:w="0" w:type="dxa"/>
-          </w:tblCellMar>
-        </w:tblPrEx>
         <w:tc>
           <w:tcPr>
             <w:tcW w:w="4680" w:type="dxa"/>
@@ -3745,61 +2675,7 @@
                 <w:sz w:val="18"/>
                 <w:szCs w:val="18"/>
               </w:rPr>
-              <w:t>GET /</w:t>
-            </w:r>
-            <w:proofErr w:type="spellStart"/>
-            <w:r>
-              <w:rPr>
-                <w:color w:val="333333"/>
-                <w:sz w:val="18"/>
-                <w:szCs w:val="18"/>
-              </w:rPr>
-              <w:t>api</w:t>
-            </w:r>
-            <w:proofErr w:type="spellEnd"/>
-            <w:r>
-              <w:rPr>
-                <w:color w:val="333333"/>
-                <w:sz w:val="18"/>
-                <w:szCs w:val="18"/>
-              </w:rPr>
-              <w:t>/</w:t>
-            </w:r>
-            <w:proofErr w:type="spellStart"/>
-            <w:r>
-              <w:rPr>
-                <w:color w:val="333333"/>
-                <w:sz w:val="18"/>
-                <w:szCs w:val="18"/>
-              </w:rPr>
-              <w:t>json</w:t>
-            </w:r>
-            <w:proofErr w:type="spellEnd"/>
-            <w:r>
-              <w:rPr>
-                <w:color w:val="333333"/>
-                <w:sz w:val="18"/>
-                <w:szCs w:val="18"/>
-              </w:rPr>
-              <w:t>/v1/1/</w:t>
-            </w:r>
-            <w:proofErr w:type="spellStart"/>
-            <w:r>
-              <w:rPr>
-                <w:color w:val="333333"/>
-                <w:sz w:val="18"/>
-                <w:szCs w:val="18"/>
-              </w:rPr>
-              <w:t>lookup.php?i</w:t>
-            </w:r>
-            <w:proofErr w:type="spellEnd"/>
-            <w:r>
-              <w:rPr>
-                <w:color w:val="333333"/>
-                <w:sz w:val="18"/>
-                <w:szCs w:val="18"/>
-              </w:rPr>
-              <w:t>={id}</w:t>
+              <w:t>GET /api/json/v1/1/lookup.php?i={id}</w:t>
             </w:r>
           </w:p>
         </w:tc>
@@ -3833,12 +2709,6 @@
         </w:tc>
       </w:tr>
       <w:tr>
-        <w:tblPrEx>
-          <w:tblCellMar>
-            <w:top w:w="0" w:type="dxa"/>
-            <w:bottom w:w="0" w:type="dxa"/>
-          </w:tblCellMar>
-        </w:tblPrEx>
         <w:tc>
           <w:tcPr>
             <w:tcW w:w="4680" w:type="dxa"/>
@@ -3863,54 +2733,8 @@
                 <w:sz w:val="18"/>
                 <w:szCs w:val="18"/>
               </w:rPr>
-              <w:t>GET /</w:t>
-            </w:r>
-            <w:proofErr w:type="spellStart"/>
-            <w:r>
-              <w:rPr>
-                <w:color w:val="333333"/>
-                <w:sz w:val="18"/>
-                <w:szCs w:val="18"/>
-              </w:rPr>
-              <w:t>api</w:t>
-            </w:r>
-            <w:proofErr w:type="spellEnd"/>
-            <w:r>
-              <w:rPr>
-                <w:color w:val="333333"/>
-                <w:sz w:val="18"/>
-                <w:szCs w:val="18"/>
-              </w:rPr>
-              <w:t>/</w:t>
-            </w:r>
-            <w:proofErr w:type="spellStart"/>
-            <w:r>
-              <w:rPr>
-                <w:color w:val="333333"/>
-                <w:sz w:val="18"/>
-                <w:szCs w:val="18"/>
-              </w:rPr>
-              <w:t>json</w:t>
-            </w:r>
-            <w:proofErr w:type="spellEnd"/>
-            <w:r>
-              <w:rPr>
-                <w:color w:val="333333"/>
-                <w:sz w:val="18"/>
-                <w:szCs w:val="18"/>
-              </w:rPr>
-              <w:t>/v1/1/</w:t>
-            </w:r>
-            <w:proofErr w:type="spellStart"/>
-            <w:r>
-              <w:rPr>
-                <w:color w:val="333333"/>
-                <w:sz w:val="18"/>
-                <w:szCs w:val="18"/>
-              </w:rPr>
-              <w:t>random.php</w:t>
-            </w:r>
-            <w:proofErr w:type="spellEnd"/>
+              <w:t>GET /api/json/v1/1/random.php</w:t>
+            </w:r>
           </w:p>
         </w:tc>
         <w:tc>
@@ -3952,7 +2776,6 @@
       <w:pPr>
         <w:spacing w:after="40"/>
       </w:pPr>
-      <w:proofErr w:type="spellStart"/>
       <w:r>
         <w:rPr>
           <w:b/>
@@ -3964,7 +2787,6 @@
         <w:lastRenderedPageBreak/>
         <w:t>MealMate</w:t>
       </w:r>
-      <w:proofErr w:type="spellEnd"/>
       <w:r>
         <w:rPr>
           <w:color w:val="2B7A9E"/>
@@ -4031,12 +2853,6 @@
         <w:gridCol w:w="1560"/>
       </w:tblGrid>
       <w:tr>
-        <w:tblPrEx>
-          <w:tblCellMar>
-            <w:top w:w="0" w:type="dxa"/>
-            <w:bottom w:w="0" w:type="dxa"/>
-          </w:tblCellMar>
-        </w:tblPrEx>
         <w:tc>
           <w:tcPr>
             <w:tcW w:w="600" w:type="dxa"/>
@@ -4189,12 +3005,6 @@
         </w:tc>
       </w:tr>
       <w:tr>
-        <w:tblPrEx>
-          <w:tblCellMar>
-            <w:top w:w="0" w:type="dxa"/>
-            <w:bottom w:w="0" w:type="dxa"/>
-          </w:tblCellMar>
-        </w:tblPrEx>
         <w:tc>
           <w:tcPr>
             <w:tcW w:w="600" w:type="dxa"/>
@@ -4324,16 +3134,26 @@
               <w:right w:w="100" w:type="dxa"/>
             </w:tcMar>
           </w:tcPr>
-          <w:p/>
+          <w:p>
+            <w:pPr>
+              <w:rPr>
+                <w:b/>
+                <w:bCs/>
+                <w:color w:val="8DD873" w:themeColor="accent6" w:themeTint="99"/>
+              </w:rPr>
+            </w:pPr>
+            <w:r>
+              <w:rPr>
+                <w:b/>
+                <w:bCs/>
+                <w:color w:val="3A7C22" w:themeColor="accent6" w:themeShade="BF"/>
+              </w:rPr>
+              <w:t>PASS</w:t>
+            </w:r>
+          </w:p>
         </w:tc>
       </w:tr>
       <w:tr>
-        <w:tblPrEx>
-          <w:tblCellMar>
-            <w:top w:w="0" w:type="dxa"/>
-            <w:bottom w:w="0" w:type="dxa"/>
-          </w:tblCellMar>
-        </w:tblPrEx>
         <w:tc>
           <w:tcPr>
             <w:tcW w:w="600" w:type="dxa"/>
@@ -4463,16 +3283,19 @@
               <w:right w:w="100" w:type="dxa"/>
             </w:tcMar>
           </w:tcPr>
-          <w:p/>
+          <w:p>
+            <w:r>
+              <w:rPr>
+                <w:b/>
+                <w:bCs/>
+                <w:color w:val="3A7C22" w:themeColor="accent6" w:themeShade="BF"/>
+              </w:rPr>
+              <w:t>PASS</w:t>
+            </w:r>
+          </w:p>
         </w:tc>
       </w:tr>
       <w:tr>
-        <w:tblPrEx>
-          <w:tblCellMar>
-            <w:top w:w="0" w:type="dxa"/>
-            <w:bottom w:w="0" w:type="dxa"/>
-          </w:tblCellMar>
-        </w:tblPrEx>
         <w:tc>
           <w:tcPr>
             <w:tcW w:w="600" w:type="dxa"/>
@@ -4602,16 +3425,19 @@
               <w:right w:w="100" w:type="dxa"/>
             </w:tcMar>
           </w:tcPr>
-          <w:p/>
+          <w:p>
+            <w:r>
+              <w:rPr>
+                <w:b/>
+                <w:bCs/>
+                <w:color w:val="3A7C22" w:themeColor="accent6" w:themeShade="BF"/>
+              </w:rPr>
+              <w:t>PASS</w:t>
+            </w:r>
+          </w:p>
         </w:tc>
       </w:tr>
       <w:tr>
-        <w:tblPrEx>
-          <w:tblCellMar>
-            <w:top w:w="0" w:type="dxa"/>
-            <w:bottom w:w="0" w:type="dxa"/>
-          </w:tblCellMar>
-        </w:tblPrEx>
         <w:tc>
           <w:tcPr>
             <w:tcW w:w="600" w:type="dxa"/>
@@ -4741,16 +3567,19 @@
               <w:right w:w="100" w:type="dxa"/>
             </w:tcMar>
           </w:tcPr>
-          <w:p/>
+          <w:p>
+            <w:r>
+              <w:rPr>
+                <w:b/>
+                <w:bCs/>
+                <w:color w:val="3A7C22" w:themeColor="accent6" w:themeShade="BF"/>
+              </w:rPr>
+              <w:t>PASS</w:t>
+            </w:r>
+          </w:p>
         </w:tc>
       </w:tr>
       <w:tr>
-        <w:tblPrEx>
-          <w:tblCellMar>
-            <w:top w:w="0" w:type="dxa"/>
-            <w:bottom w:w="0" w:type="dxa"/>
-          </w:tblCellMar>
-        </w:tblPrEx>
         <w:tc>
           <w:tcPr>
             <w:tcW w:w="600" w:type="dxa"/>
@@ -4880,16 +3709,19 @@
               <w:right w:w="100" w:type="dxa"/>
             </w:tcMar>
           </w:tcPr>
-          <w:p/>
+          <w:p>
+            <w:r>
+              <w:rPr>
+                <w:b/>
+                <w:bCs/>
+                <w:color w:val="3A7C22" w:themeColor="accent6" w:themeShade="BF"/>
+              </w:rPr>
+              <w:t>PASS</w:t>
+            </w:r>
+          </w:p>
         </w:tc>
       </w:tr>
       <w:tr>
-        <w:tblPrEx>
-          <w:tblCellMar>
-            <w:top w:w="0" w:type="dxa"/>
-            <w:bottom w:w="0" w:type="dxa"/>
-          </w:tblCellMar>
-        </w:tblPrEx>
         <w:tc>
           <w:tcPr>
             <w:tcW w:w="600" w:type="dxa"/>
@@ -5019,16 +3851,19 @@
               <w:right w:w="100" w:type="dxa"/>
             </w:tcMar>
           </w:tcPr>
-          <w:p/>
+          <w:p>
+            <w:r>
+              <w:rPr>
+                <w:b/>
+                <w:bCs/>
+                <w:color w:val="3A7C22" w:themeColor="accent6" w:themeShade="BF"/>
+              </w:rPr>
+              <w:t>PASS</w:t>
+            </w:r>
+          </w:p>
         </w:tc>
       </w:tr>
       <w:tr>
-        <w:tblPrEx>
-          <w:tblCellMar>
-            <w:top w:w="0" w:type="dxa"/>
-            <w:bottom w:w="0" w:type="dxa"/>
-          </w:tblCellMar>
-        </w:tblPrEx>
         <w:tc>
           <w:tcPr>
             <w:tcW w:w="600" w:type="dxa"/>
@@ -5158,7 +3993,16 @@
               <w:right w:w="100" w:type="dxa"/>
             </w:tcMar>
           </w:tcPr>
-          <w:p/>
+          <w:p>
+            <w:r>
+              <w:rPr>
+                <w:b/>
+                <w:bCs/>
+                <w:color w:val="3A7C22" w:themeColor="accent6" w:themeShade="BF"/>
+              </w:rPr>
+              <w:t>PASS</w:t>
+            </w:r>
+          </w:p>
         </w:tc>
       </w:tr>
     </w:tbl>
@@ -5195,12 +4039,6 @@
         <w:gridCol w:w="1560"/>
       </w:tblGrid>
       <w:tr>
-        <w:tblPrEx>
-          <w:tblCellMar>
-            <w:top w:w="0" w:type="dxa"/>
-            <w:bottom w:w="0" w:type="dxa"/>
-          </w:tblCellMar>
-        </w:tblPrEx>
         <w:tc>
           <w:tcPr>
             <w:tcW w:w="600" w:type="dxa"/>
@@ -5353,12 +4191,6 @@
         </w:tc>
       </w:tr>
       <w:tr>
-        <w:tblPrEx>
-          <w:tblCellMar>
-            <w:top w:w="0" w:type="dxa"/>
-            <w:bottom w:w="0" w:type="dxa"/>
-          </w:tblCellMar>
-        </w:tblPrEx>
         <w:tc>
           <w:tcPr>
             <w:tcW w:w="600" w:type="dxa"/>
@@ -5488,16 +4320,19 @@
               <w:right w:w="100" w:type="dxa"/>
             </w:tcMar>
           </w:tcPr>
-          <w:p/>
+          <w:p>
+            <w:r>
+              <w:rPr>
+                <w:b/>
+                <w:bCs/>
+                <w:color w:val="3A7C22" w:themeColor="accent6" w:themeShade="BF"/>
+              </w:rPr>
+              <w:t>PASS</w:t>
+            </w:r>
+          </w:p>
         </w:tc>
       </w:tr>
       <w:tr>
-        <w:tblPrEx>
-          <w:tblCellMar>
-            <w:top w:w="0" w:type="dxa"/>
-            <w:bottom w:w="0" w:type="dxa"/>
-          </w:tblCellMar>
-        </w:tblPrEx>
         <w:tc>
           <w:tcPr>
             <w:tcW w:w="600" w:type="dxa"/>
@@ -5627,16 +4462,19 @@
               <w:right w:w="100" w:type="dxa"/>
             </w:tcMar>
           </w:tcPr>
-          <w:p/>
+          <w:p>
+            <w:r>
+              <w:rPr>
+                <w:b/>
+                <w:bCs/>
+                <w:color w:val="3A7C22" w:themeColor="accent6" w:themeShade="BF"/>
+              </w:rPr>
+              <w:t>PASS</w:t>
+            </w:r>
+          </w:p>
         </w:tc>
       </w:tr>
       <w:tr>
-        <w:tblPrEx>
-          <w:tblCellMar>
-            <w:top w:w="0" w:type="dxa"/>
-            <w:bottom w:w="0" w:type="dxa"/>
-          </w:tblCellMar>
-        </w:tblPrEx>
         <w:tc>
           <w:tcPr>
             <w:tcW w:w="600" w:type="dxa"/>
@@ -5766,16 +4604,19 @@
               <w:right w:w="100" w:type="dxa"/>
             </w:tcMar>
           </w:tcPr>
-          <w:p/>
+          <w:p>
+            <w:r>
+              <w:rPr>
+                <w:b/>
+                <w:bCs/>
+                <w:color w:val="3A7C22" w:themeColor="accent6" w:themeShade="BF"/>
+              </w:rPr>
+              <w:t>PASS</w:t>
+            </w:r>
+          </w:p>
         </w:tc>
       </w:tr>
       <w:tr>
-        <w:tblPrEx>
-          <w:tblCellMar>
-            <w:top w:w="0" w:type="dxa"/>
-            <w:bottom w:w="0" w:type="dxa"/>
-          </w:tblCellMar>
-        </w:tblPrEx>
         <w:tc>
           <w:tcPr>
             <w:tcW w:w="600" w:type="dxa"/>
@@ -5905,16 +4746,19 @@
               <w:right w:w="100" w:type="dxa"/>
             </w:tcMar>
           </w:tcPr>
-          <w:p/>
+          <w:p>
+            <w:r>
+              <w:rPr>
+                <w:b/>
+                <w:bCs/>
+                <w:color w:val="3A7C22" w:themeColor="accent6" w:themeShade="BF"/>
+              </w:rPr>
+              <w:t>PASS</w:t>
+            </w:r>
+          </w:p>
         </w:tc>
       </w:tr>
       <w:tr>
-        <w:tblPrEx>
-          <w:tblCellMar>
-            <w:top w:w="0" w:type="dxa"/>
-            <w:bottom w:w="0" w:type="dxa"/>
-          </w:tblCellMar>
-        </w:tblPrEx>
         <w:tc>
           <w:tcPr>
             <w:tcW w:w="600" w:type="dxa"/>
@@ -6044,7 +4888,16 @@
               <w:right w:w="100" w:type="dxa"/>
             </w:tcMar>
           </w:tcPr>
-          <w:p/>
+          <w:p>
+            <w:r>
+              <w:rPr>
+                <w:b/>
+                <w:bCs/>
+                <w:color w:val="3A7C22" w:themeColor="accent6" w:themeShade="BF"/>
+              </w:rPr>
+              <w:t>PASS</w:t>
+            </w:r>
+          </w:p>
         </w:tc>
       </w:tr>
     </w:tbl>
@@ -6081,12 +4934,6 @@
         <w:gridCol w:w="1560"/>
       </w:tblGrid>
       <w:tr>
-        <w:tblPrEx>
-          <w:tblCellMar>
-            <w:top w:w="0" w:type="dxa"/>
-            <w:bottom w:w="0" w:type="dxa"/>
-          </w:tblCellMar>
-        </w:tblPrEx>
         <w:tc>
           <w:tcPr>
             <w:tcW w:w="600" w:type="dxa"/>
@@ -6239,12 +5086,6 @@
         </w:tc>
       </w:tr>
       <w:tr>
-        <w:tblPrEx>
-          <w:tblCellMar>
-            <w:top w:w="0" w:type="dxa"/>
-            <w:bottom w:w="0" w:type="dxa"/>
-          </w:tblCellMar>
-        </w:tblPrEx>
         <w:tc>
           <w:tcPr>
             <w:tcW w:w="600" w:type="dxa"/>
@@ -6374,16 +5215,19 @@
               <w:right w:w="100" w:type="dxa"/>
             </w:tcMar>
           </w:tcPr>
-          <w:p/>
+          <w:p>
+            <w:r>
+              <w:rPr>
+                <w:b/>
+                <w:bCs/>
+                <w:color w:val="3A7C22" w:themeColor="accent6" w:themeShade="BF"/>
+              </w:rPr>
+              <w:t>PASS</w:t>
+            </w:r>
+          </w:p>
         </w:tc>
       </w:tr>
       <w:tr>
-        <w:tblPrEx>
-          <w:tblCellMar>
-            <w:top w:w="0" w:type="dxa"/>
-            <w:bottom w:w="0" w:type="dxa"/>
-          </w:tblCellMar>
-        </w:tblPrEx>
         <w:tc>
           <w:tcPr>
             <w:tcW w:w="600" w:type="dxa"/>
@@ -6513,16 +5357,19 @@
               <w:right w:w="100" w:type="dxa"/>
             </w:tcMar>
           </w:tcPr>
-          <w:p/>
+          <w:p>
+            <w:r>
+              <w:rPr>
+                <w:b/>
+                <w:bCs/>
+                <w:color w:val="3A7C22" w:themeColor="accent6" w:themeShade="BF"/>
+              </w:rPr>
+              <w:t>PASS</w:t>
+            </w:r>
+          </w:p>
         </w:tc>
       </w:tr>
       <w:tr>
-        <w:tblPrEx>
-          <w:tblCellMar>
-            <w:top w:w="0" w:type="dxa"/>
-            <w:bottom w:w="0" w:type="dxa"/>
-          </w:tblCellMar>
-        </w:tblPrEx>
         <w:tc>
           <w:tcPr>
             <w:tcW w:w="600" w:type="dxa"/>
@@ -6652,16 +5499,19 @@
               <w:right w:w="100" w:type="dxa"/>
             </w:tcMar>
           </w:tcPr>
-          <w:p/>
+          <w:p>
+            <w:r>
+              <w:rPr>
+                <w:b/>
+                <w:bCs/>
+                <w:color w:val="3A7C22" w:themeColor="accent6" w:themeShade="BF"/>
+              </w:rPr>
+              <w:t>PASS</w:t>
+            </w:r>
+          </w:p>
         </w:tc>
       </w:tr>
       <w:tr>
-        <w:tblPrEx>
-          <w:tblCellMar>
-            <w:top w:w="0" w:type="dxa"/>
-            <w:bottom w:w="0" w:type="dxa"/>
-          </w:tblCellMar>
-        </w:tblPrEx>
         <w:tc>
           <w:tcPr>
             <w:tcW w:w="600" w:type="dxa"/>
@@ -6792,16 +5642,19 @@
               <w:right w:w="100" w:type="dxa"/>
             </w:tcMar>
           </w:tcPr>
-          <w:p/>
+          <w:p>
+            <w:r>
+              <w:rPr>
+                <w:b/>
+                <w:bCs/>
+                <w:color w:val="3A7C22" w:themeColor="accent6" w:themeShade="BF"/>
+              </w:rPr>
+              <w:t>PASS</w:t>
+            </w:r>
+          </w:p>
         </w:tc>
       </w:tr>
       <w:tr>
-        <w:tblPrEx>
-          <w:tblCellMar>
-            <w:top w:w="0" w:type="dxa"/>
-            <w:bottom w:w="0" w:type="dxa"/>
-          </w:tblCellMar>
-        </w:tblPrEx>
         <w:tc>
           <w:tcPr>
             <w:tcW w:w="600" w:type="dxa"/>
@@ -6931,16 +5784,19 @@
               <w:right w:w="100" w:type="dxa"/>
             </w:tcMar>
           </w:tcPr>
-          <w:p/>
+          <w:p>
+            <w:r>
+              <w:rPr>
+                <w:b/>
+                <w:bCs/>
+                <w:color w:val="3A7C22" w:themeColor="accent6" w:themeShade="BF"/>
+              </w:rPr>
+              <w:t>PASS</w:t>
+            </w:r>
+          </w:p>
         </w:tc>
       </w:tr>
       <w:tr>
-        <w:tblPrEx>
-          <w:tblCellMar>
-            <w:top w:w="0" w:type="dxa"/>
-            <w:bottom w:w="0" w:type="dxa"/>
-          </w:tblCellMar>
-        </w:tblPrEx>
         <w:tc>
           <w:tcPr>
             <w:tcW w:w="600" w:type="dxa"/>
@@ -7070,7 +5926,16 @@
               <w:right w:w="100" w:type="dxa"/>
             </w:tcMar>
           </w:tcPr>
-          <w:p/>
+          <w:p>
+            <w:r>
+              <w:rPr>
+                <w:b/>
+                <w:bCs/>
+                <w:color w:val="3A7C22" w:themeColor="accent6" w:themeShade="BF"/>
+              </w:rPr>
+              <w:t>PASS</w:t>
+            </w:r>
+          </w:p>
         </w:tc>
       </w:tr>
     </w:tbl>
@@ -7107,12 +5972,6 @@
         <w:gridCol w:w="1560"/>
       </w:tblGrid>
       <w:tr>
-        <w:tblPrEx>
-          <w:tblCellMar>
-            <w:top w:w="0" w:type="dxa"/>
-            <w:bottom w:w="0" w:type="dxa"/>
-          </w:tblCellMar>
-        </w:tblPrEx>
         <w:tc>
           <w:tcPr>
             <w:tcW w:w="600" w:type="dxa"/>
@@ -7265,12 +6124,6 @@
         </w:tc>
       </w:tr>
       <w:tr>
-        <w:tblPrEx>
-          <w:tblCellMar>
-            <w:top w:w="0" w:type="dxa"/>
-            <w:bottom w:w="0" w:type="dxa"/>
-          </w:tblCellMar>
-        </w:tblPrEx>
         <w:tc>
           <w:tcPr>
             <w:tcW w:w="600" w:type="dxa"/>
@@ -7400,16 +6253,19 @@
               <w:right w:w="100" w:type="dxa"/>
             </w:tcMar>
           </w:tcPr>
-          <w:p/>
+          <w:p>
+            <w:r>
+              <w:rPr>
+                <w:b/>
+                <w:bCs/>
+                <w:color w:val="3A7C22" w:themeColor="accent6" w:themeShade="BF"/>
+              </w:rPr>
+              <w:t>PASS</w:t>
+            </w:r>
+          </w:p>
         </w:tc>
       </w:tr>
       <w:tr>
-        <w:tblPrEx>
-          <w:tblCellMar>
-            <w:top w:w="0" w:type="dxa"/>
-            <w:bottom w:w="0" w:type="dxa"/>
-          </w:tblCellMar>
-        </w:tblPrEx>
         <w:tc>
           <w:tcPr>
             <w:tcW w:w="600" w:type="dxa"/>
@@ -7539,16 +6395,19 @@
               <w:right w:w="100" w:type="dxa"/>
             </w:tcMar>
           </w:tcPr>
-          <w:p/>
+          <w:p>
+            <w:r>
+              <w:rPr>
+                <w:b/>
+                <w:bCs/>
+                <w:color w:val="3A7C22" w:themeColor="accent6" w:themeShade="BF"/>
+              </w:rPr>
+              <w:t>PASS</w:t>
+            </w:r>
+          </w:p>
         </w:tc>
       </w:tr>
       <w:tr>
-        <w:tblPrEx>
-          <w:tblCellMar>
-            <w:top w:w="0" w:type="dxa"/>
-            <w:bottom w:w="0" w:type="dxa"/>
-          </w:tblCellMar>
-        </w:tblPrEx>
         <w:tc>
           <w:tcPr>
             <w:tcW w:w="600" w:type="dxa"/>
@@ -7678,16 +6537,19 @@
               <w:right w:w="100" w:type="dxa"/>
             </w:tcMar>
           </w:tcPr>
-          <w:p/>
+          <w:p>
+            <w:r>
+              <w:rPr>
+                <w:b/>
+                <w:bCs/>
+                <w:color w:val="3A7C22" w:themeColor="accent6" w:themeShade="BF"/>
+              </w:rPr>
+              <w:t>PASS</w:t>
+            </w:r>
+          </w:p>
         </w:tc>
       </w:tr>
       <w:tr>
-        <w:tblPrEx>
-          <w:tblCellMar>
-            <w:top w:w="0" w:type="dxa"/>
-            <w:bottom w:w="0" w:type="dxa"/>
-          </w:tblCellMar>
-        </w:tblPrEx>
         <w:tc>
           <w:tcPr>
             <w:tcW w:w="600" w:type="dxa"/>
@@ -7768,25 +6630,7 @@
                 <w:sz w:val="18"/>
                 <w:szCs w:val="18"/>
               </w:rPr>
-              <w:t>Type "</w:t>
-            </w:r>
-            <w:proofErr w:type="spellStart"/>
-            <w:r>
-              <w:rPr>
-                <w:color w:val="333333"/>
-                <w:sz w:val="18"/>
-                <w:szCs w:val="18"/>
-              </w:rPr>
-              <w:t>xyzabc</w:t>
-            </w:r>
-            <w:proofErr w:type="spellEnd"/>
-            <w:r>
-              <w:rPr>
-                <w:color w:val="333333"/>
-                <w:sz w:val="18"/>
-                <w:szCs w:val="18"/>
-              </w:rPr>
-              <w:t>" in search</w:t>
+              <w:t>Type "xyzabc" in search</w:t>
             </w:r>
           </w:p>
         </w:tc>
@@ -7835,16 +6679,19 @@
               <w:right w:w="100" w:type="dxa"/>
             </w:tcMar>
           </w:tcPr>
-          <w:p/>
+          <w:p>
+            <w:r>
+              <w:rPr>
+                <w:b/>
+                <w:bCs/>
+                <w:color w:val="3A7C22" w:themeColor="accent6" w:themeShade="BF"/>
+              </w:rPr>
+              <w:t>PASS</w:t>
+            </w:r>
+          </w:p>
         </w:tc>
       </w:tr>
       <w:tr>
-        <w:tblPrEx>
-          <w:tblCellMar>
-            <w:top w:w="0" w:type="dxa"/>
-            <w:bottom w:w="0" w:type="dxa"/>
-          </w:tblCellMar>
-        </w:tblPrEx>
         <w:tc>
           <w:tcPr>
             <w:tcW w:w="600" w:type="dxa"/>
@@ -7974,7 +6821,16 @@
               <w:right w:w="100" w:type="dxa"/>
             </w:tcMar>
           </w:tcPr>
-          <w:p/>
+          <w:p>
+            <w:r>
+              <w:rPr>
+                <w:b/>
+                <w:bCs/>
+                <w:color w:val="3A7C22" w:themeColor="accent6" w:themeShade="BF"/>
+              </w:rPr>
+              <w:t>PASS</w:t>
+            </w:r>
+          </w:p>
         </w:tc>
       </w:tr>
     </w:tbl>
@@ -8009,12 +6865,6 @@
         <w:gridCol w:w="1357"/>
       </w:tblGrid>
       <w:tr>
-        <w:tblPrEx>
-          <w:tblCellMar>
-            <w:top w:w="0" w:type="dxa"/>
-            <w:bottom w:w="0" w:type="dxa"/>
-          </w:tblCellMar>
-        </w:tblPrEx>
         <w:tc>
           <w:tcPr>
             <w:tcW w:w="571" w:type="dxa"/>
@@ -8107,12 +6957,6 @@
         </w:tc>
       </w:tr>
       <w:tr>
-        <w:tblPrEx>
-          <w:tblCellMar>
-            <w:top w:w="0" w:type="dxa"/>
-            <w:bottom w:w="0" w:type="dxa"/>
-          </w:tblCellMar>
-        </w:tblPrEx>
         <w:tc>
           <w:tcPr>
             <w:tcW w:w="571" w:type="dxa"/>
@@ -8138,15 +6982,7 @@
                 <w:szCs w:val="18"/>
               </w:rPr>
               <w:lastRenderedPageBreak/>
-              <w:t>N-</w:t>
-            </w:r>
-            <w:r>
-              <w:rPr>
-                <w:color w:val="333333"/>
-                <w:sz w:val="18"/>
-                <w:szCs w:val="18"/>
-              </w:rPr>
-              <w:t>1</w:t>
+              <w:t>N-1</w:t>
             </w:r>
           </w:p>
         </w:tc>
@@ -8170,6 +7006,7 @@
           <w:p>
             <w:r>
               <w:rPr>
+                <w:noProof/>
                 <w:color w:val="333333"/>
                 <w:sz w:val="18"/>
                 <w:szCs w:val="18"/>
@@ -8237,12 +7074,6 @@
         </w:tc>
       </w:tr>
       <w:tr>
-        <w:tblPrEx>
-          <w:tblCellMar>
-            <w:top w:w="0" w:type="dxa"/>
-            <w:bottom w:w="0" w:type="dxa"/>
-          </w:tblCellMar>
-        </w:tblPrEx>
         <w:tc>
           <w:tcPr>
             <w:tcW w:w="571" w:type="dxa"/>
@@ -8286,6 +7117,9 @@
           </w:tcPr>
           <w:p>
             <w:r>
+              <w:rPr>
+                <w:noProof/>
+              </w:rPr>
               <w:drawing>
                 <wp:inline distT="0" distB="0" distL="0" distR="0" wp14:anchorId="5AD4165C" wp14:editId="156ABC03">
                   <wp:extent cx="3853180" cy="8229600"/>
@@ -8349,12 +7183,6 @@
         </w:tc>
       </w:tr>
       <w:tr>
-        <w:tblPrEx>
-          <w:tblCellMar>
-            <w:top w:w="0" w:type="dxa"/>
-            <w:bottom w:w="0" w:type="dxa"/>
-          </w:tblCellMar>
-        </w:tblPrEx>
         <w:tc>
           <w:tcPr>
             <w:tcW w:w="571" w:type="dxa"/>
@@ -8398,6 +7226,9 @@
           </w:tcPr>
           <w:p>
             <w:r>
+              <w:rPr>
+                <w:noProof/>
+              </w:rPr>
               <w:drawing>
                 <wp:inline distT="0" distB="0" distL="0" distR="0" wp14:anchorId="574EF2C0" wp14:editId="0AC398F4">
                   <wp:extent cx="3667637" cy="8211696"/>
@@ -8461,12 +7292,6 @@
         </w:tc>
       </w:tr>
       <w:tr>
-        <w:tblPrEx>
-          <w:tblCellMar>
-            <w:top w:w="0" w:type="dxa"/>
-            <w:bottom w:w="0" w:type="dxa"/>
-          </w:tblCellMar>
-        </w:tblPrEx>
         <w:tc>
           <w:tcPr>
             <w:tcW w:w="571" w:type="dxa"/>
@@ -8510,6 +7335,9 @@
           </w:tcPr>
           <w:p>
             <w:r>
+              <w:rPr>
+                <w:noProof/>
+              </w:rPr>
               <w:drawing>
                 <wp:inline distT="0" distB="0" distL="0" distR="0" wp14:anchorId="2459E445" wp14:editId="2796DE6E">
                   <wp:extent cx="3896269" cy="8221222"/>
@@ -8573,12 +7401,6 @@
         </w:tc>
       </w:tr>
       <w:tr>
-        <w:tblPrEx>
-          <w:tblCellMar>
-            <w:top w:w="0" w:type="dxa"/>
-            <w:bottom w:w="0" w:type="dxa"/>
-          </w:tblCellMar>
-        </w:tblPrEx>
         <w:tc>
           <w:tcPr>
             <w:tcW w:w="571" w:type="dxa"/>
@@ -8622,6 +7444,9 @@
           </w:tcPr>
           <w:p>
             <w:r>
+              <w:rPr>
+                <w:noProof/>
+              </w:rPr>
               <w:drawing>
                 <wp:inline distT="0" distB="0" distL="0" distR="0" wp14:anchorId="32D6F52E" wp14:editId="7B88AB8A">
                   <wp:extent cx="3791479" cy="8164064"/>
@@ -8685,12 +7510,6 @@
         </w:tc>
       </w:tr>
       <w:tr>
-        <w:tblPrEx>
-          <w:tblCellMar>
-            <w:top w:w="0" w:type="dxa"/>
-            <w:bottom w:w="0" w:type="dxa"/>
-          </w:tblCellMar>
-        </w:tblPrEx>
         <w:tc>
           <w:tcPr>
             <w:tcW w:w="571" w:type="dxa"/>
@@ -8734,6 +7553,9 @@
           </w:tcPr>
           <w:p>
             <w:r>
+              <w:rPr>
+                <w:noProof/>
+              </w:rPr>
               <w:drawing>
                 <wp:inline distT="0" distB="0" distL="0" distR="0" wp14:anchorId="4ED073D5" wp14:editId="2DF886C0">
                   <wp:extent cx="3791479" cy="8125959"/>
@@ -8797,12 +7619,6 @@
         </w:tc>
       </w:tr>
       <w:tr>
-        <w:tblPrEx>
-          <w:tblCellMar>
-            <w:top w:w="0" w:type="dxa"/>
-            <w:bottom w:w="0" w:type="dxa"/>
-          </w:tblCellMar>
-        </w:tblPrEx>
         <w:tc>
           <w:tcPr>
             <w:tcW w:w="571" w:type="dxa"/>
@@ -8846,6 +7662,9 @@
           </w:tcPr>
           <w:p>
             <w:r>
+              <w:rPr>
+                <w:noProof/>
+              </w:rPr>
               <w:drawing>
                 <wp:inline distT="0" distB="0" distL="0" distR="0" wp14:anchorId="0997E871" wp14:editId="23BCFD8F">
                   <wp:extent cx="3858163" cy="8192643"/>
@@ -8909,12 +7728,6 @@
         </w:tc>
       </w:tr>
       <w:tr>
-        <w:tblPrEx>
-          <w:tblCellMar>
-            <w:top w:w="0" w:type="dxa"/>
-            <w:bottom w:w="0" w:type="dxa"/>
-          </w:tblCellMar>
-        </w:tblPrEx>
         <w:tc>
           <w:tcPr>
             <w:tcW w:w="571" w:type="dxa"/>
@@ -8959,6 +7772,7 @@
           <w:p>
             <w:r>
               <w:rPr>
+                <w:noProof/>
                 <w:color w:val="333333"/>
                 <w:sz w:val="18"/>
                 <w:szCs w:val="18"/>
@@ -9026,12 +7840,6 @@
         </w:tc>
       </w:tr>
       <w:tr>
-        <w:tblPrEx>
-          <w:tblCellMar>
-            <w:top w:w="0" w:type="dxa"/>
-            <w:bottom w:w="0" w:type="dxa"/>
-          </w:tblCellMar>
-        </w:tblPrEx>
         <w:tc>
           <w:tcPr>
             <w:tcW w:w="571" w:type="dxa"/>
@@ -9084,6 +7892,7 @@
             </w:pPr>
             <w:r>
               <w:rPr>
+                <w:noProof/>
                 <w:color w:val="333333"/>
                 <w:sz w:val="18"/>
                 <w:szCs w:val="18"/>
@@ -9151,12 +7960,6 @@
         </w:tc>
       </w:tr>
       <w:tr>
-        <w:tblPrEx>
-          <w:tblCellMar>
-            <w:top w:w="0" w:type="dxa"/>
-            <w:bottom w:w="0" w:type="dxa"/>
-          </w:tblCellMar>
-        </w:tblPrEx>
         <w:tc>
           <w:tcPr>
             <w:tcW w:w="571" w:type="dxa"/>
@@ -9217,6 +8020,9 @@
               </w:rPr>
             </w:pPr>
             <w:r>
+              <w:rPr>
+                <w:noProof/>
+              </w:rPr>
               <w:drawing>
                 <wp:inline distT="0" distB="0" distL="0" distR="0" wp14:anchorId="627A23AA" wp14:editId="02B71517">
                   <wp:extent cx="3896269" cy="8221222"/>
@@ -9290,12 +8096,6 @@
         </w:tc>
       </w:tr>
       <w:tr>
-        <w:tblPrEx>
-          <w:tblCellMar>
-            <w:top w:w="0" w:type="dxa"/>
-            <w:bottom w:w="0" w:type="dxa"/>
-          </w:tblCellMar>
-        </w:tblPrEx>
         <w:tc>
           <w:tcPr>
             <w:tcW w:w="571" w:type="dxa"/>
@@ -9347,6 +8147,7 @@
             </w:pPr>
             <w:r>
               <w:rPr>
+                <w:noProof/>
                 <w:color w:val="333333"/>
                 <w:sz w:val="18"/>
                 <w:szCs w:val="18"/>
@@ -9414,12 +8215,6 @@
         </w:tc>
       </w:tr>
       <w:tr>
-        <w:tblPrEx>
-          <w:tblCellMar>
-            <w:top w:w="0" w:type="dxa"/>
-            <w:bottom w:w="0" w:type="dxa"/>
-          </w:tblCellMar>
-        </w:tblPrEx>
         <w:tc>
           <w:tcPr>
             <w:tcW w:w="571" w:type="dxa"/>
@@ -9471,6 +8266,7 @@
             </w:pPr>
             <w:r>
               <w:rPr>
+                <w:noProof/>
                 <w:color w:val="333333"/>
                 <w:sz w:val="18"/>
                 <w:szCs w:val="18"/>
@@ -9513,6 +8309,7 @@
             </w:r>
             <w:r>
               <w:rPr>
+                <w:noProof/>
                 <w:color w:val="333333"/>
                 <w:sz w:val="18"/>
                 <w:szCs w:val="18"/>
@@ -9556,6 +8353,7 @@
             </w:r>
             <w:r>
               <w:rPr>
+                <w:noProof/>
                 <w:color w:val="333333"/>
                 <w:sz w:val="18"/>
                 <w:szCs w:val="18"/>
@@ -9692,12 +8490,6 @@
         </w:tc>
       </w:tr>
       <w:tr>
-        <w:tblPrEx>
-          <w:tblCellMar>
-            <w:top w:w="0" w:type="dxa"/>
-            <w:bottom w:w="0" w:type="dxa"/>
-          </w:tblCellMar>
-        </w:tblPrEx>
         <w:tc>
           <w:tcPr>
             <w:tcW w:w="571" w:type="dxa"/>
@@ -9749,6 +8541,7 @@
             </w:pPr>
             <w:r>
               <w:rPr>
+                <w:noProof/>
                 <w:color w:val="333333"/>
                 <w:sz w:val="18"/>
                 <w:szCs w:val="18"/>
@@ -9800,6 +8593,7 @@
             </w:pPr>
             <w:r>
               <w:rPr>
+                <w:noProof/>
                 <w:color w:val="333333"/>
                 <w:sz w:val="18"/>
                 <w:szCs w:val="18"/>
@@ -9904,12 +8698,6 @@
         </w:tc>
       </w:tr>
       <w:tr>
-        <w:tblPrEx>
-          <w:tblCellMar>
-            <w:top w:w="0" w:type="dxa"/>
-            <w:bottom w:w="0" w:type="dxa"/>
-          </w:tblCellMar>
-        </w:tblPrEx>
         <w:tc>
           <w:tcPr>
             <w:tcW w:w="571" w:type="dxa"/>
@@ -9961,6 +8749,7 @@
             </w:pPr>
             <w:r>
               <w:rPr>
+                <w:noProof/>
                 <w:color w:val="333333"/>
                 <w:sz w:val="18"/>
                 <w:szCs w:val="18"/>
@@ -10012,6 +8801,7 @@
             </w:pPr>
             <w:r>
               <w:rPr>
+                <w:noProof/>
                 <w:color w:val="333333"/>
                 <w:sz w:val="18"/>
                 <w:szCs w:val="18"/>
@@ -10063,6 +8853,7 @@
             </w:pPr>
             <w:r>
               <w:rPr>
+                <w:noProof/>
                 <w:color w:val="333333"/>
                 <w:sz w:val="18"/>
                 <w:szCs w:val="18"/>
@@ -10171,12 +8962,6 @@
         </w:tc>
       </w:tr>
       <w:tr>
-        <w:tblPrEx>
-          <w:tblCellMar>
-            <w:top w:w="0" w:type="dxa"/>
-            <w:bottom w:w="0" w:type="dxa"/>
-          </w:tblCellMar>
-        </w:tblPrEx>
         <w:tc>
           <w:tcPr>
             <w:tcW w:w="571" w:type="dxa"/>
@@ -10228,6 +9013,7 @@
             </w:pPr>
             <w:r>
               <w:rPr>
+                <w:noProof/>
                 <w:color w:val="333333"/>
                 <w:sz w:val="18"/>
                 <w:szCs w:val="18"/>
@@ -10270,6 +9056,7 @@
             </w:r>
             <w:r>
               <w:rPr>
+                <w:noProof/>
                 <w:color w:val="333333"/>
                 <w:sz w:val="18"/>
                 <w:szCs w:val="18"/>
@@ -10374,12 +9161,6 @@
         </w:tc>
       </w:tr>
       <w:tr>
-        <w:tblPrEx>
-          <w:tblCellMar>
-            <w:top w:w="0" w:type="dxa"/>
-            <w:bottom w:w="0" w:type="dxa"/>
-          </w:tblCellMar>
-        </w:tblPrEx>
         <w:tc>
           <w:tcPr>
             <w:tcW w:w="571" w:type="dxa"/>
@@ -10431,6 +9212,7 @@
             </w:pPr>
             <w:r>
               <w:rPr>
+                <w:noProof/>
                 <w:color w:val="333333"/>
                 <w:sz w:val="18"/>
                 <w:szCs w:val="18"/>
@@ -10482,6 +9264,7 @@
             </w:pPr>
             <w:r>
               <w:rPr>
+                <w:noProof/>
                 <w:color w:val="333333"/>
                 <w:sz w:val="18"/>
                 <w:szCs w:val="18"/>
@@ -10545,15 +9328,7 @@
           <w:p>
             <w:r>
               <w:lastRenderedPageBreak/>
-              <w:t xml:space="preserve">Recent search terms on </w:t>
-            </w:r>
-            <w:proofErr w:type="gramStart"/>
-            <w:r>
-              <w:t>Home</w:t>
-            </w:r>
-            <w:proofErr w:type="gramEnd"/>
-            <w:r>
-              <w:t xml:space="preserve"> screen</w:t>
+              <w:t>Recent search terms on Home screen</w:t>
             </w:r>
           </w:p>
           <w:p/>
@@ -10610,26 +9385,12 @@
           <w:p>
             <w:r>
               <w:lastRenderedPageBreak/>
-              <w:t xml:space="preserve">Correct </w:t>
-            </w:r>
-            <w:proofErr w:type="spellStart"/>
-            <w:r>
-              <w:t>seach</w:t>
-            </w:r>
-            <w:proofErr w:type="spellEnd"/>
-            <w:r>
-              <w:t xml:space="preserve"> results loaded</w:t>
+              <w:t>Correct seach results loaded</w:t>
             </w:r>
           </w:p>
         </w:tc>
       </w:tr>
       <w:tr>
-        <w:tblPrEx>
-          <w:tblCellMar>
-            <w:top w:w="0" w:type="dxa"/>
-            <w:bottom w:w="0" w:type="dxa"/>
-          </w:tblCellMar>
-        </w:tblPrEx>
         <w:tc>
           <w:tcPr>
             <w:tcW w:w="571" w:type="dxa"/>
@@ -10681,6 +9442,7 @@
             </w:pPr>
             <w:r>
               <w:rPr>
+                <w:noProof/>
                 <w:color w:val="333333"/>
                 <w:sz w:val="18"/>
                 <w:szCs w:val="18"/>
@@ -10748,12 +9510,6 @@
         </w:tc>
       </w:tr>
       <w:tr>
-        <w:tblPrEx>
-          <w:tblCellMar>
-            <w:top w:w="0" w:type="dxa"/>
-            <w:bottom w:w="0" w:type="dxa"/>
-          </w:tblCellMar>
-        </w:tblPrEx>
         <w:tc>
           <w:tcPr>
             <w:tcW w:w="571" w:type="dxa"/>
@@ -10805,6 +9561,7 @@
             </w:pPr>
             <w:r>
               <w:rPr>
+                <w:noProof/>
                 <w:color w:val="333333"/>
                 <w:sz w:val="18"/>
                 <w:szCs w:val="18"/>
@@ -10872,12 +9629,6 @@
         </w:tc>
       </w:tr>
       <w:tr>
-        <w:tblPrEx>
-          <w:tblCellMar>
-            <w:top w:w="0" w:type="dxa"/>
-            <w:bottom w:w="0" w:type="dxa"/>
-          </w:tblCellMar>
-        </w:tblPrEx>
         <w:tc>
           <w:tcPr>
             <w:tcW w:w="571" w:type="dxa"/>
@@ -10928,6 +9679,9 @@
               </w:rPr>
             </w:pPr>
             <w:r>
+              <w:rPr>
+                <w:noProof/>
+              </w:rPr>
               <w:drawing>
                 <wp:inline distT="0" distB="0" distL="0" distR="0" wp14:anchorId="6CC68DFF" wp14:editId="1842564B">
                   <wp:extent cx="3791479" cy="8125959"/>
@@ -10991,12 +9745,6 @@
         </w:tc>
       </w:tr>
       <w:tr>
-        <w:tblPrEx>
-          <w:tblCellMar>
-            <w:top w:w="0" w:type="dxa"/>
-            <w:bottom w:w="0" w:type="dxa"/>
-          </w:tblCellMar>
-        </w:tblPrEx>
         <w:tc>
           <w:tcPr>
             <w:tcW w:w="571" w:type="dxa"/>
@@ -11048,6 +9796,7 @@
             </w:pPr>
             <w:r>
               <w:rPr>
+                <w:noProof/>
                 <w:color w:val="333333"/>
                 <w:sz w:val="18"/>
                 <w:szCs w:val="18"/>
@@ -11115,12 +9864,6 @@
         </w:tc>
       </w:tr>
       <w:tr>
-        <w:tblPrEx>
-          <w:tblCellMar>
-            <w:top w:w="0" w:type="dxa"/>
-            <w:bottom w:w="0" w:type="dxa"/>
-          </w:tblCellMar>
-        </w:tblPrEx>
         <w:tc>
           <w:tcPr>
             <w:tcW w:w="571" w:type="dxa"/>
@@ -11172,6 +9915,7 @@
             </w:pPr>
             <w:r>
               <w:rPr>
+                <w:noProof/>
                 <w:color w:val="333333"/>
                 <w:sz w:val="18"/>
                 <w:szCs w:val="18"/>
@@ -11272,12 +10016,6 @@
         <w:gridCol w:w="3560"/>
       </w:tblGrid>
       <w:tr>
-        <w:tblPrEx>
-          <w:tblCellMar>
-            <w:top w:w="0" w:type="dxa"/>
-            <w:bottom w:w="0" w:type="dxa"/>
-          </w:tblCellMar>
-        </w:tblPrEx>
         <w:tc>
           <w:tcPr>
             <w:tcW w:w="600" w:type="dxa"/>
@@ -11400,12 +10138,6 @@
         </w:tc>
       </w:tr>
       <w:tr>
-        <w:tblPrEx>
-          <w:tblCellMar>
-            <w:top w:w="0" w:type="dxa"/>
-            <w:bottom w:w="0" w:type="dxa"/>
-          </w:tblCellMar>
-        </w:tblPrEx>
         <w:tc>
           <w:tcPr>
             <w:tcW w:w="600" w:type="dxa"/>
@@ -11505,12 +10237,6 @@
         </w:tc>
       </w:tr>
       <w:tr>
-        <w:tblPrEx>
-          <w:tblCellMar>
-            <w:top w:w="0" w:type="dxa"/>
-            <w:bottom w:w="0" w:type="dxa"/>
-          </w:tblCellMar>
-        </w:tblPrEx>
         <w:tc>
           <w:tcPr>
             <w:tcW w:w="600" w:type="dxa"/>
@@ -12203,6 +10929,7 @@
   <w:style w:type="character" w:default="1" w:styleId="DefaultParagraphFont">
     <w:name w:val="Default Paragraph Font"/>
     <w:uiPriority w:val="1"/>
+    <w:semiHidden/>
     <w:unhideWhenUsed/>
   </w:style>
   <w:style w:type="table" w:default="1" w:styleId="TableNormal">

</xml_diff>